<commit_message>
Update conference article for separated frontend and backend
</commit_message>
<xml_diff>
--- a/docs/conference-article-sveltekit-mongodb.docx
+++ b/docs/conference-article-sveltekit-mongodb.docx
@@ -4,286 +4,89 @@
   <w:body>
     <w:p>
       <w:pPr>
-        <w:spacing w:after="240"/>
-        <w:jc w:val="center"/>
+        <w:pStyle w:val="AbstractText"/>
+        <w:jc w:val="left"/>
       </w:pPr>
       <w:r>
         <w:rPr>
-          <w:b/>
-          <w:sz w:val="28"/>
+          <w:i/>
         </w:rPr>
-        <w:t xml:space="preserve">Hierarchical and Non-Relational Data Structures in MongoDB: A Case Study of a </w:t>
-      </w:r>
-      <w:proofErr w:type="spellStart"/>
-      <w:r>
-        <w:rPr>
-          <w:b/>
-          <w:sz w:val="28"/>
-        </w:rPr>
-        <w:t>SvelteKit</w:t>
-      </w:r>
-      <w:proofErr w:type="spellEnd"/>
-      <w:r>
-        <w:rPr>
-          <w:b/>
-          <w:sz w:val="28"/>
-        </w:rPr>
-        <w:t xml:space="preserve"> Reservation Management System</w:t>
+        <w:t>European Integration - Realities and Perspectives. Proceedings 2025</w:t>
       </w:r>
     </w:p>
     <w:p>
       <w:pPr>
-        <w:spacing w:after="60"/>
-        <w:jc w:val="center"/>
+        <w:pStyle w:val="AbstractText"/>
+        <w:jc w:val="left"/>
+      </w:pPr>
+      <w:r>
+        <w:t>ISSN: 2067 - 9211</w:t>
+      </w:r>
+    </w:p>
+    <w:p/>
+    <w:p>
+      <w:pPr>
+        <w:pStyle w:val="PaperTitle"/>
+      </w:pPr>
+      <w:r>
+        <w:t>Hierarchical and Non-Relational Data Structures in MongoDB: A Case Study of a Reservation Management System</w:t>
+      </w:r>
+    </w:p>
+    <w:p>
+      <w:pPr>
+        <w:pStyle w:val="Authors"/>
       </w:pPr>
       <w:proofErr w:type="spellStart"/>
       <w:r>
-        <w:rPr>
-          <w:sz w:val="24"/>
-        </w:rPr>
         <w:t>Teșcan</w:t>
       </w:r>
       <w:proofErr w:type="spellEnd"/>
       <w:r>
-        <w:rPr>
-          <w:sz w:val="24"/>
-        </w:rPr>
-        <w:t xml:space="preserve"> Costel-Petruț, Burlacu Cosmin-Petrică, Stratulat Dragoș-Catalin, Nistor Gabriel-Andrei, </w:t>
-      </w:r>
-      <w:proofErr w:type="spellStart"/>
-      <w:r>
-        <w:rPr>
-          <w:sz w:val="24"/>
-        </w:rPr>
-        <w:t>Caramaliu</w:t>
-      </w:r>
-      <w:proofErr w:type="spellEnd"/>
-      <w:r>
-        <w:rPr>
-          <w:sz w:val="24"/>
-        </w:rPr>
-        <w:t xml:space="preserve"> Gabriel-Bogdan, Andar Lucian</w:t>
+        <w:t xml:space="preserve"> Costel-Petruț, Burlacu Cosmin-Petrică, Stratulat Dragoș-Cătălin, Nistor Gabriel-Andrei, Caramaliu Gabriel-Bogdan, Andar Lucian</w:t>
       </w:r>
     </w:p>
     <w:p>
       <w:pPr>
-        <w:spacing w:after="60"/>
-        <w:jc w:val="center"/>
-      </w:pPr>
-      <w:proofErr w:type="spellStart"/>
-      <w:r>
-        <w:t>Universitatea</w:t>
-      </w:r>
-      <w:proofErr w:type="spellEnd"/>
-      <w:r>
-        <w:t xml:space="preserve"> </w:t>
-      </w:r>
-      <w:proofErr w:type="spellStart"/>
-      <w:r>
-        <w:t>Internațională</w:t>
-      </w:r>
-      <w:proofErr w:type="spellEnd"/>
-      <w:r>
-        <w:t xml:space="preserve"> </w:t>
-      </w:r>
-      <w:proofErr w:type="spellStart"/>
-      <w:r>
-        <w:t>Danubius</w:t>
-      </w:r>
-      <w:proofErr w:type="spellEnd"/>
-      <w:r>
-        <w:t xml:space="preserve"> </w:t>
-      </w:r>
-      <w:proofErr w:type="spellStart"/>
-      <w:r>
-        <w:t>Galați</w:t>
-      </w:r>
-      <w:proofErr w:type="spellEnd"/>
-      <w:r>
-        <w:t xml:space="preserve">, </w:t>
-      </w:r>
-      <w:proofErr w:type="spellStart"/>
-      <w:r>
-        <w:t>Facultatea</w:t>
-      </w:r>
-      <w:proofErr w:type="spellEnd"/>
-      <w:r>
-        <w:t xml:space="preserve"> de Media, Design </w:t>
-      </w:r>
-      <w:proofErr w:type="spellStart"/>
-      <w:r>
-        <w:t>și</w:t>
-      </w:r>
-      <w:proofErr w:type="spellEnd"/>
-      <w:r>
-        <w:t xml:space="preserve"> </w:t>
-      </w:r>
-      <w:proofErr w:type="spellStart"/>
-      <w:r>
-        <w:t>Tehnologie</w:t>
-      </w:r>
-      <w:proofErr w:type="spellEnd"/>
-    </w:p>
-    <w:p>
-      <w:pPr>
-        <w:spacing w:after="240"/>
-        <w:jc w:val="center"/>
+        <w:pStyle w:val="Affiliation"/>
       </w:pPr>
       <w:r>
-        <w:rPr>
-          <w:sz w:val="18"/>
-        </w:rPr>
-        <w:t>tescancostelpetrut@gmai</w:t>
-      </w:r>
-      <w:r>
-        <w:rPr>
-          <w:sz w:val="18"/>
-        </w:rPr>
-        <w:t>l</w:t>
-      </w:r>
-      <w:r>
-        <w:rPr>
-          <w:sz w:val="18"/>
-        </w:rPr>
-        <w:t>.com; burlacucosmin28@gmail.com; catalin.stratulat@gmail.com; nistor.gabriel.andrei@gmail.com; bogdancaramaliu@yahoo.com; andar73@libero.it</w:t>
+        <w:t>Danubius International University of Galați, Faculty of Media, Design and Technology, Romania</w:t>
       </w:r>
     </w:p>
     <w:p>
       <w:pPr>
-        <w:spacing w:after="120"/>
-        <w:jc w:val="both"/>
+        <w:pStyle w:val="Affiliation"/>
       </w:pPr>
       <w:r>
-        <w:rPr>
-          <w:sz w:val="18"/>
-        </w:rPr>
-        <w:t xml:space="preserve">Abstract: Objectives: This paper presents a practical study of hierarchical and non-relational data structures in MongoDB through a reservation management system. Prior Work: The study </w:t>
+        <w:t>tescancostelpetrut@gmai</w:t>
       </w:r>
-      <w:proofErr w:type="gramStart"/>
       <w:r>
-        <w:rPr>
-          <w:sz w:val="18"/>
-        </w:rPr>
-        <w:t>builds on</w:t>
+        <w:t>l</w:t>
       </w:r>
-      <w:proofErr w:type="gramEnd"/>
       <w:r>
-        <w:rPr>
-          <w:sz w:val="18"/>
-        </w:rPr>
-        <w:t xml:space="preserve"> document-oriented database modeling, embedded documents, references and full-stack web development with </w:t>
+        <w:t>.com</w:t>
       </w:r>
-      <w:proofErr w:type="spellStart"/>
       <w:r>
-        <w:rPr>
-          <w:sz w:val="18"/>
-        </w:rPr>
-        <w:t>SvelteKit</w:t>
+        <w:t>;</w:t>
       </w:r>
-      <w:proofErr w:type="spellEnd"/>
       <w:r>
-        <w:rPr>
-          <w:sz w:val="18"/>
-        </w:rPr>
-        <w:t xml:space="preserve">. Approach: A case study application was developed using </w:t>
-      </w:r>
-      <w:proofErr w:type="spellStart"/>
-      <w:r>
-        <w:rPr>
-          <w:sz w:val="18"/>
-        </w:rPr>
-        <w:t>SvelteKit</w:t>
-      </w:r>
-      <w:proofErr w:type="spellEnd"/>
-      <w:r>
-        <w:rPr>
-          <w:sz w:val="18"/>
-        </w:rPr>
-        <w:t>, TypeScript and MongoDB. Resources store predefined available time slots as embedded documents, and users create reservations by selecting one of these intervals. Results: The prototype manages rooms, laboratories, equipment and a guided building tour, while updating slot availability after each reservation. Implications: The system demonstrates a clear educational example for students and researchers studying NoSQL modeling. Value: The contribution is a complete full-stack implementation that connects hierarchical MongoDB design with a functional reservation interface.</w:t>
+        <w:t xml:space="preserve"> burlacucosmin28@gmail.com; catalin.stratulat@gmail.com; nistor.gabriel.andrei@gmail.com; bogdancaramaliu@yahoo.com; andar73@libero.it</w:t>
       </w:r>
     </w:p>
     <w:p>
       <w:pPr>
-        <w:spacing w:after="120"/>
+        <w:pStyle w:val="AbstractText"/>
       </w:pPr>
       <w:r>
-        <w:rPr>
-          <w:sz w:val="18"/>
-        </w:rPr>
-        <w:t>Keywords: web app; time slots; server routes; TypeScript</w:t>
-      </w:r>
-      <w:r>
-        <w:rPr>
-          <w:sz w:val="18"/>
-        </w:rPr>
-        <w:t>; MongoDB</w:t>
+        <w:t>Abstract: Objectives: This paper presents a reservation management system used to demonstrate hierarchical and non-relational data structures in MongoDB. Prior Work: The study builds on document-oriented data modeling, embedded documents, references, and full-stack web application development. Approach: A case study application was developed with a separated SvelteKit frontend and Express backend. Users select a resource and enter a start and end interval, while the backend validates the request against embedded availability windows stored in MongoDB. Results: The prototype successfully separates frontend and backend responsibilities, stores hierarchical resource availability data, and prevents invalid or overlapping reservations. Implications: The system can support academic demonstrations of NoSQL modeling and practical reservation workflows. Value: The main contribution is a clear implementation that combines user-selected intervals with hierarchical MongoDB documents.</w:t>
       </w:r>
     </w:p>
     <w:p>
       <w:pPr>
-        <w:spacing w:after="240"/>
+        <w:pStyle w:val="AbstractText"/>
       </w:pPr>
       <w:r>
-        <w:rPr>
-          <w:sz w:val="18"/>
-        </w:rPr>
-        <w:t>JEL Classification: C88; L86; O33</w:t>
-      </w:r>
-    </w:p>
-    <w:p>
-      <w:pPr>
-        <w:spacing w:before="240" w:after="60"/>
-      </w:pPr>
-      <w:r>
-        <w:rPr>
-          <w:b/>
-          <w:i/>
-          <w:sz w:val="24"/>
-        </w:rPr>
-        <w:t>1. Introduction</w:t>
-      </w:r>
-    </w:p>
-    <w:p>
-      <w:pPr>
-        <w:spacing w:after="120"/>
-        <w:jc w:val="both"/>
-      </w:pPr>
-      <w:r>
-        <w:t xml:space="preserve">Modern information systems frequently manage data that is not naturally represented only as flat tables. Web applications often include entities with nested structures, variable attributes and relationships that depend on application access patterns. For this reason, NoSQL databases became important because they offer alternative ways of storing and accessing data in comparison with traditional relational database systems. </w:t>
-      </w:r>
-      <w:proofErr w:type="spellStart"/>
-      <w:r>
-        <w:t>Sadalage</w:t>
-      </w:r>
-      <w:proofErr w:type="spellEnd"/>
-      <w:r>
-        <w:t xml:space="preserve"> and Fowler describe NoSQL as a family of database approaches that can support different data models, including document-oriented models (</w:t>
-      </w:r>
-      <w:proofErr w:type="spellStart"/>
-      <w:r>
-        <w:t>Sadalage</w:t>
-      </w:r>
-      <w:proofErr w:type="spellEnd"/>
-      <w:r>
-        <w:t xml:space="preserve"> &amp; Fowler, 2012).</w:t>
-      </w:r>
-    </w:p>
-    <w:p>
-      <w:pPr>
-        <w:spacing w:after="120"/>
-        <w:jc w:val="both"/>
-      </w:pPr>
-      <w:r>
-        <w:t>MongoDB is a document-oriented database in which relationships can be modeled either by embedding related data in the same document or by referencing data stored in another collection. MongoDB documentation emphasizes that the data model should be selected according to the application's access patterns (MongoDB, 2026a). Embedded documents are especially relevant when related information is frequently accessed together, because a document can contain arrays and subdocuments in a single structure (MongoDB, 2026b).</w:t>
-      </w:r>
-    </w:p>
-    <w:p>
-      <w:pPr>
-        <w:spacing w:after="120"/>
-        <w:jc w:val="both"/>
-      </w:pPr>
-      <w:r>
-        <w:t xml:space="preserve">The purpose of this paper is to analyze and implement a practical reservation management system using MongoDB as a non-relational database and </w:t>
+        <w:t xml:space="preserve">Keywords: Reservation; </w:t>
       </w:r>
       <w:proofErr w:type="spellStart"/>
       <w:r>
@@ -291,329 +94,213 @@
       </w:r>
       <w:proofErr w:type="spellEnd"/>
       <w:r>
-        <w:t xml:space="preserve"> as the full-stack web framework. The implemented system follows a booking pattern </w:t>
+        <w:t xml:space="preserve">; Express; TypeScript; </w:t>
       </w:r>
-      <w:proofErr w:type="gramStart"/>
       <w:r>
-        <w:t>similar to</w:t>
-      </w:r>
-      <w:proofErr w:type="gramEnd"/>
-      <w:r>
-        <w:t xml:space="preserve"> online reservation platforms: the user does not manually enter arbitrary start and end </w:t>
-      </w:r>
-      <w:proofErr w:type="gramStart"/>
-      <w:r>
-        <w:t>dates, but</w:t>
-      </w:r>
-      <w:proofErr w:type="gramEnd"/>
-      <w:r>
-        <w:t xml:space="preserve"> selects from predefined available time slots. These time slots are embedded inside resource documents, which makes the hierarchical MongoDB structure visible and relevant to the research topic.</w:t>
+        <w:t>MongoDB</w:t>
       </w:r>
     </w:p>
     <w:p>
       <w:pPr>
-        <w:spacing w:after="120"/>
-        <w:jc w:val="both"/>
+        <w:pStyle w:val="AbstractText"/>
       </w:pPr>
       <w:r>
-        <w:t xml:space="preserve">The case study includes rooms, a laboratory, equipment items such as a bicycle, a Christmas tree, a PlayStation and a DVD, </w:t>
-      </w:r>
-      <w:proofErr w:type="gramStart"/>
-      <w:r>
-        <w:t>and also</w:t>
-      </w:r>
-      <w:proofErr w:type="gramEnd"/>
-      <w:r>
-        <w:t xml:space="preserve"> a scheduled service: a guided building tour. This extended resource set demonstrates that the same model can handle both physical objects and scheduled services.</w:t>
+        <w:t>JEL Classification: C88; O33; L86</w:t>
       </w:r>
     </w:p>
     <w:p>
       <w:pPr>
-        <w:spacing w:before="240" w:after="60"/>
-        <w:rPr>
-          <w:b/>
-          <w:i/>
-          <w:sz w:val="24"/>
-        </w:rPr>
+        <w:pStyle w:val="SectionHeading"/>
       </w:pPr>
+      <w:r>
+        <w:t>1. Introduction</w:t>
+      </w:r>
+    </w:p>
+    <w:p>
+      <w:r>
+        <w:t>Modern software systems often need to store flexible, nested and changing data structures. Relational databases remain important, but many application scenarios are naturally represented using documents, arrays and embedded objects. Reservation systems are a useful example because they combine users, resources, availability intervals and confirmed reservations. A non-relational approach can represent these elements without forcing every nested component into a separate table.</w:t>
+      </w:r>
+    </w:p>
+    <w:p>
+      <w:r>
+        <w:t>MongoDB is a document-oriented database that supports flexible data modeling through embedded documents and references. The official MongoDB documentation describes data modeling as a process in which relationships can be represented either by embedding related data or by storing references, depending on application access patterns (MongoDB, 2026a). Embedded data models are especially useful when related data is frequently accessed together (MongoDB, 2026b).</w:t>
+      </w:r>
+    </w:p>
+    <w:p>
+      <w:r>
+        <w:t>This paper presents a reservation management system built as a case study for hierarchical and non-relational data structures in MongoDB. The final implementation separates the frontend and backend into two distinct parts. The frontend is implemented with SvelteKit, while the backend is implemented with Express and MongoDB. The SvelteKit routing model is based on filesystem routes in the source directory (Svelte, 2026), while Express provides a minimal web framework for building HTTP APIs in Node.js (Express, 2026).</w:t>
+      </w:r>
+    </w:p>
+    <w:p>
+      <w:r>
+        <w:t>The main improvement compared with a hardcoded time slot demonstration is that the user can now enter a custom start and end interval in the frontend. The backend receives this interval as a slot object and validates it against availability windows embedded inside MongoDB resource documents. This approach preserves the hierarchical MongoDB model while making the reservation flow more realistic.</w:t>
+      </w:r>
     </w:p>
     <w:p>
       <w:pPr>
-        <w:spacing w:before="240" w:after="60"/>
+        <w:pStyle w:val="SectionHeading"/>
       </w:pPr>
       <w:r>
-        <w:rPr>
-          <w:b/>
-          <w:i/>
-          <w:sz w:val="24"/>
-        </w:rPr>
         <w:lastRenderedPageBreak/>
         <w:t>2. Related Work</w:t>
       </w:r>
     </w:p>
     <w:p>
-      <w:pPr>
-        <w:spacing w:after="120"/>
-        <w:jc w:val="both"/>
-      </w:pPr>
       <w:r>
-        <w:t>The literature on NoSQL databases highlights that document databases are useful when an application benefits from flexible structures and document-level aggregation. In a document database, related data can be grouped according to how the application reads and writes it. This approach is different from normalization in relational databases, where related data is commonly divided into multiple tables.</w:t>
+        <w:t>NoSQL databases were introduced to address data storage needs that do not always fit rigid relational schemas. Sadalage and Fowler (2012) describe NoSQL systems as a group of database technologies that emphasize flexible models and scalability. Document databases are particularly suitable when data can be represented as hierarchical objects.</w:t>
+      </w:r>
+    </w:p>
+    <w:p>
+      <w:r>
+        <w:t>MongoDB supports a document model in which each record is represented as a document. Such documents can contain nested objects and arrays. In this project, the resource document contains an embedded array named availabilityWindows. This design follows the idea of embedding related data directly inside the parent document when the data has a strong ownership relationship (MongoDB, 2026b).</w:t>
+      </w:r>
+    </w:p>
+    <w:p>
+      <w:r>
+        <w:t>The project also uses references. A reservation document references a user through userId and a resource through resourceId. This follows the mixed modeling approach recommended for cases where some data is embedded and other data remains independent (MongoDB, 2026a).</w:t>
+      </w:r>
+    </w:p>
+    <w:p>
+      <w:r>
+        <w:t>For the web application layer, the project uses SvelteKit on the frontend and Express on the backend. SvelteKit provides a component-based frontend application, while Express provides a separate HTTP server. This separation makes the architecture clearer because the user interface, server logic and database access are located in different folders and run on different ports.</w:t>
       </w:r>
     </w:p>
     <w:p>
       <w:pPr>
-        <w:spacing w:after="120"/>
-        <w:jc w:val="both"/>
+        <w:pStyle w:val="SectionHeading"/>
       </w:pPr>
       <w:r>
-        <w:t>MongoDB documentation distinguishes between embedded data and referenced data. Embedded documents store related data in a single document structure and may contain arrays and subdocuments (MongoDB, 2026b). References are useful when entities are independent and need to be queried separately. The present project combines both strategies: time slots are embedded inside resources, while reservations reference users, resources and selected time slots.</w:t>
+        <w:t>3. Problem Statement</w:t>
+      </w:r>
+    </w:p>
+    <w:p>
+      <w:r>
+        <w:t>The initial reservation prototype stored frontend and backend logic inside one full-stack SvelteKit application. Although such an architecture is technically valid, it does not make the separation between frontend and backend immediately visible. For an academic case study, a clearer separation is useful because the reader can identify where the user interface ends and where the server-side MongoDB logic begins.</w:t>
+      </w:r>
+    </w:p>
+    <w:p>
+      <w:r>
+        <w:t>Another issue is the use of predefined time slot identifiers. A user can select a fixed slot, but the system does not show the flow where the user provides start and end values from the interface. The improved version solves this by allowing the user to select a custom interval using datetime inputs. The backend then validates the selected interval.</w:t>
+      </w:r>
+    </w:p>
+    <w:p>
+      <w:r>
+        <w:t>The problem addressed by this paper is therefore twofold: first, to design a clear frontend/backend separation; second, to preserve MongoDB hierarchical modeling while supporting user-selected start and end reservation intervals.</w:t>
       </w:r>
     </w:p>
     <w:p>
       <w:pPr>
-        <w:spacing w:after="120"/>
-        <w:jc w:val="both"/>
+        <w:pStyle w:val="SectionHeading"/>
       </w:pPr>
       <w:r>
-        <w:t xml:space="preserve">Full-stack web frameworks also influence the architecture of database-driven systems. </w:t>
+        <w:t>4. Concepts and Terms</w:t>
       </w:r>
-      <w:proofErr w:type="spellStart"/>
+    </w:p>
+    <w:p>
       <w:r>
-        <w:t>SvelteKit</w:t>
+        <w:t>The main concepts used in the system are User, Resource, TimeSlot, Reservation and SystemState. A user is a person who can create a reservation. A resource is an item or service that can be reserved. Examples include conference rooms, laboratories, equipment, a bicycle, a PlayStation, a DVD item and a guided building tour.</w:t>
       </w:r>
-      <w:proofErr w:type="spellEnd"/>
+    </w:p>
+    <w:p>
       <w:r>
-        <w:t xml:space="preserve"> uses a filesystem-based router, where URL paths are defined by directories in the codebase (Svelte, 2026). This makes it possible to organize frontend pages and backend API endpoints in the same application. The MongoDB Node.js driver supports JavaScript and TypeScript applications that interact with MongoDB data (MongoDB, 2026c).</w:t>
+        <w:t>A TimeSlot represents a start and end interval. In the final model, resource availability is represented by embedded availability windows. A reservation also contains a selected slot, which stores the interval chosen by the user.</w:t>
+      </w:r>
+    </w:p>
+    <w:p>
+      <w:r>
+        <w:t>SystemState is an in-memory representation of users, resources and reservations loaded from MongoDB. The backend creates this state, applies domain logic, and then saves the updated state back to the database.</w:t>
       </w:r>
     </w:p>
     <w:p>
       <w:pPr>
-        <w:spacing w:before="240" w:after="60"/>
+        <w:pStyle w:val="SectionHeading"/>
+      </w:pPr>
+    </w:p>
+    <w:p>
+      <w:pPr>
+        <w:pStyle w:val="SectionHeading"/>
       </w:pPr>
       <w:r>
-        <w:rPr>
-          <w:b/>
-          <w:i/>
-          <w:sz w:val="24"/>
-        </w:rPr>
-        <w:t>3. Problem Statement</w:t>
+        <w:lastRenderedPageBreak/>
+        <w:t>5. Solution Approach</w:t>
+      </w:r>
+    </w:p>
+    <w:p>
+      <w:r>
+        <w:t>The solution is implemented as two separate applications inside the same GitHub repository. The frontend folder contains the SvelteKit application. The backend folder contains the Express server, MongoDB connection, route handlers and domain logic. This structure makes the role of each part explicit.</w:t>
+      </w:r>
+    </w:p>
+    <w:p>
+      <w:r>
+        <w:t>The frontend runs on http://localhost:5173. It displays users, resources, availability windows and existing reservations. The user selects a resource and enters a start and end interval. The frontend sends the following JSON payload to the backend:</w:t>
       </w:r>
     </w:p>
     <w:p>
       <w:pPr>
-        <w:spacing w:after="120"/>
-        <w:jc w:val="both"/>
+        <w:pStyle w:val="CodeText"/>
       </w:pPr>
       <w:r>
-        <w:t>The problem addressed in this paper is the design and implementation of a reservation management system that can represent hierarchical and non-relational data in a clear and practical way. The system must allow a user to choose a resource, choose one of several predefined available intervals and create a reservation.</w:t>
+        <w:rPr>
+          <w:rFonts w:ascii="Times New Roman" w:eastAsia="Times New Roman" w:hAnsi="Times New Roman"/>
+        </w:rPr>
+        <w:t>{</w:t>
       </w:r>
     </w:p>
     <w:p>
       <w:pPr>
-        <w:spacing w:after="120"/>
-        <w:jc w:val="both"/>
+        <w:pStyle w:val="CodeText"/>
       </w:pPr>
       <w:r>
-        <w:t>A strictly relational model would typically represent users, resources, time slots and reservations as separate tables connected through foreign keys. This model is valid, but it may not reflect the natural structure of this case study. In the implemented system, time slots belong directly to resources, so embedding them inside resource documents provides a more intuitive document structure.</w:t>
+        <w:rPr>
+          <w:rFonts w:ascii="Times New Roman" w:eastAsia="Times New Roman" w:hAnsi="Times New Roman"/>
+        </w:rPr>
+        <w:t xml:space="preserve">  "userId": "user_1",</w:t>
       </w:r>
     </w:p>
     <w:p>
       <w:pPr>
-        <w:spacing w:after="120"/>
-        <w:jc w:val="both"/>
+        <w:pStyle w:val="CodeText"/>
       </w:pPr>
       <w:r>
-        <w:t>The research question is therefore: how can a reservation management system be modeled and implemented using hierarchical MongoDB documents while still preserving validation, separation of concerns and a functional web interface?</w:t>
+        <w:rPr>
+          <w:rFonts w:ascii="Times New Roman" w:eastAsia="Times New Roman" w:hAnsi="Times New Roman"/>
+        </w:rPr>
+        <w:t xml:space="preserve">  "resourceId": "resource_1",</w:t>
       </w:r>
     </w:p>
     <w:p>
       <w:pPr>
-        <w:spacing w:before="240" w:after="60"/>
+        <w:pStyle w:val="CodeText"/>
       </w:pPr>
       <w:r>
         <w:rPr>
-          <w:b/>
-          <w:i/>
-          <w:sz w:val="24"/>
+          <w:rFonts w:ascii="Times New Roman" w:eastAsia="Times New Roman" w:hAnsi="Times New Roman"/>
         </w:rPr>
-        <w:t>4. Concepts and Terms</w:t>
+        <w:t xml:space="preserve">  "slot": { "start": "2026-05-20T09:30:00.000Z", "end": "2026-05-20T10:00:00.000Z" }</w:t>
       </w:r>
     </w:p>
     <w:p>
       <w:pPr>
-        <w:spacing w:after="120"/>
-        <w:jc w:val="both"/>
+        <w:pStyle w:val="CodeText"/>
       </w:pPr>
       <w:r>
-        <w:t>A MongoDB collection is a group of documents. A document is a JSON-like data structure that can contain fields, nested objects and arrays. In this project, the main collections are users, resources and reservations.</w:t>
+        <w:rPr>
+          <w:rFonts w:ascii="Times New Roman" w:eastAsia="Times New Roman" w:hAnsi="Times New Roman"/>
+        </w:rPr>
+        <w:t>}</w:t>
+      </w:r>
+    </w:p>
+    <w:p>
+      <w:r>
+        <w:t>The backend runs on http://localhost:3000. It exposes endpoints for users, resources, reservations and seed data. When a reservation request is received, the backend loads the current state from MongoDB and calls the createReservation function.</w:t>
       </w:r>
     </w:p>
     <w:p>
       <w:pPr>
-        <w:spacing w:after="120"/>
-        <w:jc w:val="both"/>
+        <w:pStyle w:val="Legend"/>
       </w:pPr>
       <w:r>
-        <w:t xml:space="preserve">An embedded document is a document or object stored inside another document. The project uses this concept for time slots, because each resource contains its own </w:t>
-      </w:r>
-      <w:proofErr w:type="spellStart"/>
-      <w:r>
-        <w:t>timeSlots</w:t>
-      </w:r>
-      <w:proofErr w:type="spellEnd"/>
-      <w:r>
-        <w:t xml:space="preserve"> array. A reference is an identifier stored in one document that points to another entity. Reservations use references through </w:t>
-      </w:r>
-      <w:proofErr w:type="spellStart"/>
-      <w:r>
-        <w:t>userId</w:t>
-      </w:r>
-      <w:proofErr w:type="spellEnd"/>
-      <w:r>
-        <w:t xml:space="preserve">, </w:t>
-      </w:r>
-      <w:proofErr w:type="spellStart"/>
-      <w:r>
-        <w:t>resourceId</w:t>
-      </w:r>
-      <w:proofErr w:type="spellEnd"/>
-      <w:r>
-        <w:t xml:space="preserve"> and </w:t>
-      </w:r>
-      <w:proofErr w:type="spellStart"/>
-      <w:r>
-        <w:t>timeSlotId</w:t>
-      </w:r>
-      <w:proofErr w:type="spellEnd"/>
-      <w:r>
-        <w:t>.</w:t>
-      </w:r>
-    </w:p>
-    <w:p>
-      <w:pPr>
-        <w:spacing w:after="120"/>
-        <w:jc w:val="both"/>
-      </w:pPr>
-      <w:r>
-        <w:t xml:space="preserve">The TypeScript domain layer defines the core concepts of the system. The User type represents a person who can create reservations. The Resource type represents a reservable item or scheduled service. The </w:t>
-      </w:r>
-      <w:proofErr w:type="spellStart"/>
-      <w:r>
-        <w:t>TimeSlot</w:t>
-      </w:r>
-      <w:proofErr w:type="spellEnd"/>
-      <w:r>
-        <w:t xml:space="preserve"> type represents a predefined available interval. The Reservation type represents a confirmed booking. The </w:t>
-      </w:r>
-      <w:proofErr w:type="spellStart"/>
-      <w:r>
-        <w:t>SystemState</w:t>
-      </w:r>
-      <w:proofErr w:type="spellEnd"/>
-      <w:r>
-        <w:t xml:space="preserve"> type groups users, resources and reservations into an in-memory state used by the validation logic.</w:t>
-      </w:r>
-    </w:p>
-    <w:p>
-      <w:pPr>
-        <w:spacing w:after="120"/>
-        <w:jc w:val="both"/>
-      </w:pPr>
-      <w:r>
-        <w:lastRenderedPageBreak/>
-        <w:t xml:space="preserve">The prototype also uses three functional-style helpers: Maybe, Validation and </w:t>
-      </w:r>
-      <w:proofErr w:type="spellStart"/>
-      <w:r>
-        <w:t>StateFn</w:t>
-      </w:r>
-      <w:proofErr w:type="spellEnd"/>
-      <w:r>
-        <w:t xml:space="preserve">. Maybe represents optional values, Validation represents either a valid result or a list of errors, and </w:t>
-      </w:r>
-      <w:proofErr w:type="spellStart"/>
-      <w:r>
-        <w:t>StateFn</w:t>
-      </w:r>
-      <w:proofErr w:type="spellEnd"/>
-      <w:r>
-        <w:t xml:space="preserve"> represents a transformation from one system state to another.</w:t>
-      </w:r>
-    </w:p>
-    <w:p>
-      <w:pPr>
-        <w:spacing w:before="240" w:after="60"/>
-      </w:pPr>
-      <w:r>
-        <w:rPr>
-          <w:b/>
-          <w:i/>
-          <w:sz w:val="24"/>
-        </w:rPr>
-        <w:t>5. Solution Approach</w:t>
-      </w:r>
-    </w:p>
-    <w:p>
-      <w:pPr>
-        <w:spacing w:after="120"/>
-        <w:jc w:val="both"/>
-      </w:pPr>
-      <w:r>
-        <w:t xml:space="preserve">The solution was developed as a case study. The first step was to define the TypeScript domain model. The second step was to design the MongoDB collections. The third step was to implement </w:t>
-      </w:r>
-      <w:proofErr w:type="spellStart"/>
-      <w:r>
-        <w:t>SvelteKit</w:t>
-      </w:r>
-      <w:proofErr w:type="spellEnd"/>
-      <w:r>
-        <w:t xml:space="preserve"> API endpoints. The fourth step was to build a Svelte interface where the user can select a resource and choose an available slot.</w:t>
-      </w:r>
-    </w:p>
-    <w:p>
-      <w:pPr>
-        <w:spacing w:after="120"/>
-        <w:jc w:val="both"/>
-      </w:pPr>
-      <w:r>
-        <w:t xml:space="preserve">The architecture separates the system into three main layers. The presentation layer is represented by Svelte pages. The API layer is represented by </w:t>
-      </w:r>
-      <w:proofErr w:type="spellStart"/>
-      <w:r>
-        <w:t>SvelteKit</w:t>
-      </w:r>
-      <w:proofErr w:type="spellEnd"/>
-      <w:r>
-        <w:t xml:space="preserve"> server routes. The domain layer is represented by TypeScript files containing types and validation logic. The persistence layer is represented by MongoDB collections accessed through the official Node.js driver.</w:t>
-      </w:r>
-    </w:p>
-    <w:p>
-      <w:pPr>
-        <w:spacing w:after="120"/>
-        <w:jc w:val="both"/>
-      </w:pPr>
-      <w:r>
-        <w:t xml:space="preserve">The decision to use predefined available slots was intentional. It follows the recommendation that users should choose from available intervals, </w:t>
-      </w:r>
-      <w:proofErr w:type="gramStart"/>
-      <w:r>
-        <w:t>similar to</w:t>
-      </w:r>
-      <w:proofErr w:type="gramEnd"/>
-      <w:r>
-        <w:t xml:space="preserve"> online booking systems. This also strengthens the MongoDB modeling objective because the available intervals are embedded directly inside resource documents.</w:t>
-      </w:r>
-    </w:p>
-    <w:p>
-      <w:pPr>
-        <w:spacing w:before="160" w:after="0"/>
-      </w:pPr>
-      <w:r>
-        <w:rPr>
-          <w:b/>
-          <w:sz w:val="20"/>
-        </w:rPr>
-        <w:t>Table 1. Main Architectural Layers of the Implemented System</w:t>
+        <w:t>Table 1. Main project layers and responsibilities</w:t>
       </w:r>
     </w:p>
     <w:tbl>
@@ -630,15 +317,19 @@
       </w:tblGrid>
       <w:tr>
         <w:trPr>
+          <w:cantSplit/>
           <w:jc w:val="center"/>
         </w:trPr>
         <w:tc>
           <w:tcPr>
             <w:tcW w:w="3024" w:type="dxa"/>
-            <w:shd w:val="clear" w:color="auto" w:fill="D9EAF7"/>
             <w:vAlign w:val="center"/>
           </w:tcPr>
           <w:p>
+            <w:pPr>
+              <w:spacing w:after="0"/>
+              <w:jc w:val="left"/>
+            </w:pPr>
             <w:r>
               <w:rPr>
                 <w:b/>
@@ -651,51 +342,19 @@
         <w:tc>
           <w:tcPr>
             <w:tcW w:w="3024" w:type="dxa"/>
-            <w:shd w:val="clear" w:color="auto" w:fill="D9EAF7"/>
             <w:vAlign w:val="center"/>
           </w:tcPr>
           <w:p>
+            <w:pPr>
+              <w:spacing w:after="0"/>
+              <w:jc w:val="left"/>
+            </w:pPr>
             <w:r>
               <w:rPr>
                 <w:b/>
                 <w:sz w:val="20"/>
               </w:rPr>
-              <w:t>Implementation</w:t>
-            </w:r>
-          </w:p>
-        </w:tc>
-        <w:tc>
-          <w:tcPr>
-            <w:tcW w:w="3024" w:type="dxa"/>
-            <w:shd w:val="clear" w:color="auto" w:fill="D9EAF7"/>
-            <w:vAlign w:val="center"/>
-          </w:tcPr>
-          <w:p>
-            <w:r>
-              <w:rPr>
-                <w:b/>
-                <w:sz w:val="20"/>
-              </w:rPr>
-              <w:t>Role</w:t>
-            </w:r>
-          </w:p>
-        </w:tc>
-      </w:tr>
-      <w:tr>
-        <w:trPr>
-          <w:jc w:val="center"/>
-        </w:trPr>
-        <w:tc>
-          <w:tcPr>
-            <w:tcW w:w="3024" w:type="dxa"/>
-            <w:vAlign w:val="center"/>
-          </w:tcPr>
-          <w:p>
-            <w:r>
-              <w:rPr>
-                <w:sz w:val="20"/>
-              </w:rPr>
-              <w:t>Presentation layer</w:t>
+              <w:t>Folder</w:t>
             </w:r>
           </w:p>
         </w:tc>
@@ -705,11 +364,40 @@
             <w:vAlign w:val="center"/>
           </w:tcPr>
           <w:p>
+            <w:pPr>
+              <w:spacing w:after="0"/>
+              <w:jc w:val="left"/>
+            </w:pPr>
+            <w:r>
+              <w:rPr>
+                <w:b/>
+                <w:sz w:val="20"/>
+              </w:rPr>
+              <w:t>Responsibility</w:t>
+            </w:r>
+          </w:p>
+        </w:tc>
+      </w:tr>
+      <w:tr>
+        <w:trPr>
+          <w:cantSplit/>
+          <w:jc w:val="center"/>
+        </w:trPr>
+        <w:tc>
+          <w:tcPr>
+            <w:tcW w:w="3024" w:type="dxa"/>
+            <w:vAlign w:val="center"/>
+          </w:tcPr>
+          <w:p>
+            <w:pPr>
+              <w:spacing w:after="0"/>
+              <w:jc w:val="left"/>
+            </w:pPr>
             <w:r>
               <w:rPr>
                 <w:sz w:val="20"/>
               </w:rPr>
-              <w:t>Svelte pages</w:t>
+              <w:t>Frontend</w:t>
             </w:r>
           </w:p>
         </w:tc>
@@ -719,30 +407,15 @@
             <w:vAlign w:val="center"/>
           </w:tcPr>
           <w:p>
+            <w:pPr>
+              <w:spacing w:after="0"/>
+              <w:jc w:val="left"/>
+            </w:pPr>
             <w:r>
               <w:rPr>
                 <w:sz w:val="20"/>
               </w:rPr>
-              <w:t>Displays resources, slots and reservations</w:t>
-            </w:r>
-          </w:p>
-        </w:tc>
-      </w:tr>
-      <w:tr>
-        <w:trPr>
-          <w:jc w:val="center"/>
-        </w:trPr>
-        <w:tc>
-          <w:tcPr>
-            <w:tcW w:w="3024" w:type="dxa"/>
-            <w:vAlign w:val="center"/>
-          </w:tcPr>
-          <w:p>
-            <w:r>
-              <w:rPr>
-                <w:sz w:val="20"/>
-              </w:rPr>
-              <w:t>API layer</w:t>
+              <w:t>frontend/</w:t>
             </w:r>
           </w:p>
         </w:tc>
@@ -752,19 +425,39 @@
             <w:vAlign w:val="center"/>
           </w:tcPr>
           <w:p>
-            <w:proofErr w:type="spellStart"/>
+            <w:pPr>
+              <w:spacing w:after="0"/>
+              <w:jc w:val="left"/>
+            </w:pPr>
             <w:r>
               <w:rPr>
                 <w:sz w:val="20"/>
               </w:rPr>
-              <w:t>SvelteKit</w:t>
+              <w:t>User interface, data display and HTTP requests</w:t>
             </w:r>
-            <w:proofErr w:type="spellEnd"/>
+          </w:p>
+        </w:tc>
+      </w:tr>
+      <w:tr>
+        <w:trPr>
+          <w:cantSplit/>
+          <w:jc w:val="center"/>
+        </w:trPr>
+        <w:tc>
+          <w:tcPr>
+            <w:tcW w:w="3024" w:type="dxa"/>
+            <w:vAlign w:val="center"/>
+          </w:tcPr>
+          <w:p>
+            <w:pPr>
+              <w:spacing w:after="0"/>
+              <w:jc w:val="left"/>
+            </w:pPr>
             <w:r>
               <w:rPr>
                 <w:sz w:val="20"/>
               </w:rPr>
-              <w:t xml:space="preserve"> server routes</w:t>
+              <w:t>Backend</w:t>
             </w:r>
           </w:p>
         </w:tc>
@@ -774,38 +467,15 @@
             <w:vAlign w:val="center"/>
           </w:tcPr>
           <w:p>
-            <w:proofErr w:type="gramStart"/>
+            <w:pPr>
+              <w:spacing w:after="0"/>
+              <w:jc w:val="left"/>
+            </w:pPr>
             <w:r>
               <w:rPr>
                 <w:sz w:val="20"/>
               </w:rPr>
-              <w:t>Handles HTTP</w:t>
-            </w:r>
-            <w:proofErr w:type="gramEnd"/>
-            <w:r>
-              <w:rPr>
-                <w:sz w:val="20"/>
-              </w:rPr>
-              <w:t xml:space="preserve"> requests and responses</w:t>
-            </w:r>
-          </w:p>
-        </w:tc>
-      </w:tr>
-      <w:tr>
-        <w:trPr>
-          <w:jc w:val="center"/>
-        </w:trPr>
-        <w:tc>
-          <w:tcPr>
-            <w:tcW w:w="3024" w:type="dxa"/>
-            <w:vAlign w:val="center"/>
-          </w:tcPr>
-          <w:p>
-            <w:r>
-              <w:rPr>
-                <w:sz w:val="20"/>
-              </w:rPr>
-              <w:t>Domain layer</w:t>
+              <w:t>backend/</w:t>
             </w:r>
           </w:p>
         </w:tc>
@@ -815,11 +485,39 @@
             <w:vAlign w:val="center"/>
           </w:tcPr>
           <w:p>
+            <w:pPr>
+              <w:spacing w:after="0"/>
+              <w:jc w:val="left"/>
+            </w:pPr>
             <w:r>
               <w:rPr>
                 <w:sz w:val="20"/>
               </w:rPr>
-              <w:t>TypeScript files</w:t>
+              <w:t>Validation, API routes and MongoDB access</w:t>
+            </w:r>
+          </w:p>
+        </w:tc>
+      </w:tr>
+      <w:tr>
+        <w:trPr>
+          <w:cantSplit/>
+          <w:jc w:val="center"/>
+        </w:trPr>
+        <w:tc>
+          <w:tcPr>
+            <w:tcW w:w="3024" w:type="dxa"/>
+            <w:vAlign w:val="center"/>
+          </w:tcPr>
+          <w:p>
+            <w:pPr>
+              <w:spacing w:after="0"/>
+              <w:jc w:val="left"/>
+            </w:pPr>
+            <w:r>
+              <w:rPr>
+                <w:sz w:val="20"/>
+              </w:rPr>
+              <w:t>Database</w:t>
             </w:r>
           </w:p>
         </w:tc>
@@ -829,30 +527,15 @@
             <w:vAlign w:val="center"/>
           </w:tcPr>
           <w:p>
+            <w:pPr>
+              <w:spacing w:after="0"/>
+              <w:jc w:val="left"/>
+            </w:pPr>
             <w:r>
               <w:rPr>
                 <w:sz w:val="20"/>
               </w:rPr>
-              <w:t>Validates reservation rules</w:t>
-            </w:r>
-          </w:p>
-        </w:tc>
-      </w:tr>
-      <w:tr>
-        <w:trPr>
-          <w:jc w:val="center"/>
-        </w:trPr>
-        <w:tc>
-          <w:tcPr>
-            <w:tcW w:w="3024" w:type="dxa"/>
-            <w:vAlign w:val="center"/>
-          </w:tcPr>
-          <w:p>
-            <w:r>
-              <w:rPr>
-                <w:sz w:val="20"/>
-              </w:rPr>
-              <w:t>Persistence layer</w:t>
+              <w:t>MongoDB</w:t>
             </w:r>
           </w:p>
         </w:tc>
@@ -862,25 +545,15 @@
             <w:vAlign w:val="center"/>
           </w:tcPr>
           <w:p>
+            <w:pPr>
+              <w:spacing w:after="0"/>
+              <w:jc w:val="left"/>
+            </w:pPr>
             <w:r>
               <w:rPr>
                 <w:sz w:val="20"/>
               </w:rPr>
-              <w:t>MongoDB collections</w:t>
-            </w:r>
-          </w:p>
-        </w:tc>
-        <w:tc>
-          <w:tcPr>
-            <w:tcW w:w="3024" w:type="dxa"/>
-            <w:vAlign w:val="center"/>
-          </w:tcPr>
-          <w:p>
-            <w:r>
-              <w:rPr>
-                <w:sz w:val="20"/>
-              </w:rPr>
-              <w:t>Stores users, resources and reservations</w:t>
+              <w:t>Users, resources, availability windows and reservations</w:t>
             </w:r>
           </w:p>
         </w:tc>
@@ -888,1195 +561,258 @@
     </w:tbl>
     <w:p>
       <w:pPr>
-        <w:spacing w:after="80"/>
-        <w:jc w:val="both"/>
+        <w:pStyle w:val="SectionHeading"/>
       </w:pPr>
+      <w:r>
+        <w:t>6. MongoDB Data Model</w:t>
+      </w:r>
     </w:p>
     <w:p>
-      <w:pPr>
-        <w:spacing w:before="240" w:after="60"/>
-      </w:pPr>
       <w:r>
-        <w:rPr>
-          <w:b/>
-          <w:i/>
-          <w:sz w:val="24"/>
-        </w:rPr>
-        <w:t>6. Application Implementation</w:t>
+        <w:t>The MongoDB database is named reservation_system and contains three main collections: users, resources and reservations. The most important hierarchical structure is the resources collection. Each resource contains an embedded availabilityWindows array.</w:t>
+      </w:r>
+    </w:p>
+    <w:p>
+      <w:r>
+        <w:t>A resource document has the following conceptual structure:</w:t>
       </w:r>
     </w:p>
     <w:p>
       <w:pPr>
-        <w:spacing w:after="120"/>
-        <w:jc w:val="both"/>
+        <w:pStyle w:val="CodeText"/>
       </w:pPr>
       <w:r>
-        <w:t>The application is stored in the app folder of the repository. The main user interface is implemented in the reservations page. The page loads users, resources and reservations through API endpoints and displays the booking process as a sequence of steps: select user, select resource, select time slot and confirm reservation.</w:t>
+        <w:rPr>
+          <w:rFonts w:ascii="Times New Roman" w:eastAsia="Times New Roman" w:hAnsi="Times New Roman"/>
+        </w:rPr>
+        <w:t>Resource</w:t>
       </w:r>
     </w:p>
     <w:p>
       <w:pPr>
-        <w:spacing w:after="120"/>
-        <w:jc w:val="both"/>
+        <w:pStyle w:val="CodeText"/>
       </w:pPr>
       <w:r>
-        <w:t>The resource list includes Conference Room A, Conference Room B, Computer Science Laboratory, Projector Kit, Bicycle, Christmas Tree, PlayStation, DVD and Guided Building Tour. The guided building tour extends the system beyond physical objects and demonstrates that the model can also manage scheduled services.</w:t>
+        <w:rPr>
+          <w:rFonts w:ascii="Times New Roman" w:eastAsia="Times New Roman" w:hAnsi="Times New Roman"/>
+        </w:rPr>
+        <w:t>└── availabilityWindows[]</w:t>
       </w:r>
     </w:p>
     <w:p>
       <w:pPr>
-        <w:spacing w:after="120"/>
-        <w:jc w:val="both"/>
+        <w:pStyle w:val="CodeText"/>
       </w:pPr>
       <w:r>
-        <w:t xml:space="preserve">When the user creates a reservation, the Svelte page sends a POST request to the reservations API endpoint. The endpoint loads the current state from MongoDB, calls the </w:t>
-      </w:r>
-      <w:proofErr w:type="spellStart"/>
-      <w:r>
-        <w:t>createReservation</w:t>
-      </w:r>
-      <w:proofErr w:type="spellEnd"/>
-      <w:r>
-        <w:t xml:space="preserve"> function and either returns validation errors or inserts the reservation. If the reservation is valid, the selected embedded time slot is marked as unavailable inside the related resource document.</w:t>
+        <w:rPr>
+          <w:rFonts w:ascii="Times New Roman" w:eastAsia="Times New Roman" w:hAnsi="Times New Roman"/>
+        </w:rPr>
+        <w:t xml:space="preserve">    ├── TimeSlot</w:t>
       </w:r>
     </w:p>
     <w:p>
       <w:pPr>
-        <w:spacing w:before="160" w:after="0"/>
-        <w:rPr>
-          <w:b/>
-          <w:sz w:val="20"/>
-        </w:rPr>
-      </w:pPr>
-    </w:p>
-    <w:p>
-      <w:pPr>
-        <w:spacing w:before="160" w:after="0"/>
-        <w:rPr>
-          <w:b/>
-          <w:sz w:val="20"/>
-        </w:rPr>
-      </w:pPr>
-    </w:p>
-    <w:p>
-      <w:pPr>
-        <w:spacing w:before="160" w:after="0"/>
-        <w:rPr>
-          <w:b/>
-          <w:sz w:val="20"/>
-        </w:rPr>
-      </w:pPr>
-    </w:p>
-    <w:p>
-      <w:pPr>
-        <w:spacing w:before="160" w:after="0"/>
-        <w:rPr>
-          <w:b/>
-          <w:sz w:val="20"/>
-        </w:rPr>
-      </w:pPr>
-    </w:p>
-    <w:p>
-      <w:pPr>
-        <w:spacing w:before="160" w:after="0"/>
+        <w:pStyle w:val="CodeText"/>
       </w:pPr>
       <w:r>
         <w:rPr>
-          <w:b/>
-          <w:sz w:val="20"/>
+          <w:rFonts w:ascii="Times New Roman" w:eastAsia="Times New Roman" w:hAnsi="Times New Roman"/>
         </w:rPr>
-        <w:lastRenderedPageBreak/>
-        <w:t>Table 2. Sample Reservable Resources</w:t>
-      </w:r>
-    </w:p>
-    <w:tbl>
-      <w:tblPr>
-        <w:tblStyle w:val="Tabelgril"/>
-        <w:tblW w:w="0" w:type="auto"/>
-        <w:jc w:val="center"/>
-        <w:tblLook w:val="04A0" w:firstRow="1" w:lastRow="0" w:firstColumn="1" w:lastColumn="0" w:noHBand="0" w:noVBand="1"/>
-      </w:tblPr>
-      <w:tblGrid>
-        <w:gridCol w:w="3024"/>
-        <w:gridCol w:w="3024"/>
-        <w:gridCol w:w="3024"/>
-      </w:tblGrid>
-      <w:tr>
-        <w:trPr>
-          <w:jc w:val="center"/>
-        </w:trPr>
-        <w:tc>
-          <w:tcPr>
-            <w:tcW w:w="3024" w:type="dxa"/>
-            <w:shd w:val="clear" w:color="auto" w:fill="D9EAF7"/>
-            <w:vAlign w:val="center"/>
-          </w:tcPr>
-          <w:p>
-            <w:r>
-              <w:rPr>
-                <w:b/>
-                <w:sz w:val="20"/>
-              </w:rPr>
-              <w:t>Resource</w:t>
-            </w:r>
-          </w:p>
-        </w:tc>
-        <w:tc>
-          <w:tcPr>
-            <w:tcW w:w="3024" w:type="dxa"/>
-            <w:shd w:val="clear" w:color="auto" w:fill="D9EAF7"/>
-            <w:vAlign w:val="center"/>
-          </w:tcPr>
-          <w:p>
-            <w:r>
-              <w:rPr>
-                <w:b/>
-                <w:sz w:val="20"/>
-              </w:rPr>
-              <w:t>Type</w:t>
-            </w:r>
-          </w:p>
-        </w:tc>
-        <w:tc>
-          <w:tcPr>
-            <w:tcW w:w="3024" w:type="dxa"/>
-            <w:shd w:val="clear" w:color="auto" w:fill="D9EAF7"/>
-            <w:vAlign w:val="center"/>
-          </w:tcPr>
-          <w:p>
-            <w:r>
-              <w:rPr>
-                <w:b/>
-                <w:sz w:val="20"/>
-              </w:rPr>
-              <w:t>Purpose</w:t>
-            </w:r>
-          </w:p>
-        </w:tc>
-      </w:tr>
-      <w:tr>
-        <w:trPr>
-          <w:jc w:val="center"/>
-        </w:trPr>
-        <w:tc>
-          <w:tcPr>
-            <w:tcW w:w="3024" w:type="dxa"/>
-            <w:vAlign w:val="center"/>
-          </w:tcPr>
-          <w:p>
-            <w:r>
-              <w:rPr>
-                <w:sz w:val="20"/>
-              </w:rPr>
-              <w:t>Conference Room A / B</w:t>
-            </w:r>
-          </w:p>
-        </w:tc>
-        <w:tc>
-          <w:tcPr>
-            <w:tcW w:w="3024" w:type="dxa"/>
-            <w:vAlign w:val="center"/>
-          </w:tcPr>
-          <w:p>
-            <w:r>
-              <w:rPr>
-                <w:sz w:val="20"/>
-              </w:rPr>
-              <w:t>room</w:t>
-            </w:r>
-          </w:p>
-        </w:tc>
-        <w:tc>
-          <w:tcPr>
-            <w:tcW w:w="3024" w:type="dxa"/>
-            <w:vAlign w:val="center"/>
-          </w:tcPr>
-          <w:p>
-            <w:r>
-              <w:rPr>
-                <w:sz w:val="20"/>
-              </w:rPr>
-              <w:t>Room reservation</w:t>
-            </w:r>
-          </w:p>
-        </w:tc>
-      </w:tr>
-      <w:tr>
-        <w:trPr>
-          <w:jc w:val="center"/>
-        </w:trPr>
-        <w:tc>
-          <w:tcPr>
-            <w:tcW w:w="3024" w:type="dxa"/>
-            <w:vAlign w:val="center"/>
-          </w:tcPr>
-          <w:p>
-            <w:r>
-              <w:rPr>
-                <w:sz w:val="20"/>
-              </w:rPr>
-              <w:t>Computer Science Laboratory</w:t>
-            </w:r>
-          </w:p>
-        </w:tc>
-        <w:tc>
-          <w:tcPr>
-            <w:tcW w:w="3024" w:type="dxa"/>
-            <w:vAlign w:val="center"/>
-          </w:tcPr>
-          <w:p>
-            <w:r>
-              <w:rPr>
-                <w:sz w:val="20"/>
-              </w:rPr>
-              <w:t>laboratory</w:t>
-            </w:r>
-          </w:p>
-        </w:tc>
-        <w:tc>
-          <w:tcPr>
-            <w:tcW w:w="3024" w:type="dxa"/>
-            <w:vAlign w:val="center"/>
-          </w:tcPr>
-          <w:p>
-            <w:r>
-              <w:rPr>
-                <w:sz w:val="20"/>
-              </w:rPr>
-              <w:t>Academic laboratory booking</w:t>
-            </w:r>
-          </w:p>
-        </w:tc>
-      </w:tr>
-      <w:tr>
-        <w:trPr>
-          <w:jc w:val="center"/>
-        </w:trPr>
-        <w:tc>
-          <w:tcPr>
-            <w:tcW w:w="3024" w:type="dxa"/>
-            <w:vAlign w:val="center"/>
-          </w:tcPr>
-          <w:p>
-            <w:r>
-              <w:rPr>
-                <w:sz w:val="20"/>
-              </w:rPr>
-              <w:t>Projector Kit, Bicycle, Christmas Tree, PlayStation, DVD</w:t>
-            </w:r>
-          </w:p>
-        </w:tc>
-        <w:tc>
-          <w:tcPr>
-            <w:tcW w:w="3024" w:type="dxa"/>
-            <w:vAlign w:val="center"/>
-          </w:tcPr>
-          <w:p>
-            <w:r>
-              <w:rPr>
-                <w:sz w:val="20"/>
-              </w:rPr>
-              <w:t>equipment</w:t>
-            </w:r>
-          </w:p>
-        </w:tc>
-        <w:tc>
-          <w:tcPr>
-            <w:tcW w:w="3024" w:type="dxa"/>
-            <w:vAlign w:val="center"/>
-          </w:tcPr>
-          <w:p>
-            <w:r>
-              <w:rPr>
-                <w:sz w:val="20"/>
-              </w:rPr>
-              <w:t>Physical item reservation</w:t>
-            </w:r>
-          </w:p>
-        </w:tc>
-      </w:tr>
-      <w:tr>
-        <w:trPr>
-          <w:jc w:val="center"/>
-        </w:trPr>
-        <w:tc>
-          <w:tcPr>
-            <w:tcW w:w="3024" w:type="dxa"/>
-            <w:vAlign w:val="center"/>
-          </w:tcPr>
-          <w:p>
-            <w:r>
-              <w:rPr>
-                <w:sz w:val="20"/>
-              </w:rPr>
-              <w:t>Guided Building Tour</w:t>
-            </w:r>
-          </w:p>
-        </w:tc>
-        <w:tc>
-          <w:tcPr>
-            <w:tcW w:w="3024" w:type="dxa"/>
-            <w:vAlign w:val="center"/>
-          </w:tcPr>
-          <w:p>
-            <w:r>
-              <w:rPr>
-                <w:sz w:val="20"/>
-              </w:rPr>
-              <w:t>tour</w:t>
-            </w:r>
-          </w:p>
-        </w:tc>
-        <w:tc>
-          <w:tcPr>
-            <w:tcW w:w="3024" w:type="dxa"/>
-            <w:vAlign w:val="center"/>
-          </w:tcPr>
-          <w:p>
-            <w:r>
-              <w:rPr>
-                <w:sz w:val="20"/>
-              </w:rPr>
-              <w:t>Scheduled guided service</w:t>
-            </w:r>
-          </w:p>
-        </w:tc>
-      </w:tr>
-    </w:tbl>
-    <w:p/>
-    <w:p>
-      <w:pPr>
-        <w:spacing w:before="160" w:after="0"/>
-      </w:pPr>
-      <w:r>
-        <w:rPr>
-          <w:b/>
-          <w:sz w:val="20"/>
-        </w:rPr>
-        <w:t>Table 3. API Endpoints</w:t>
-      </w:r>
-    </w:p>
-    <w:tbl>
-      <w:tblPr>
-        <w:tblStyle w:val="Tabelgril"/>
-        <w:tblW w:w="0" w:type="auto"/>
-        <w:jc w:val="center"/>
-        <w:tblLook w:val="04A0" w:firstRow="1" w:lastRow="0" w:firstColumn="1" w:lastColumn="0" w:noHBand="0" w:noVBand="1"/>
-      </w:tblPr>
-      <w:tblGrid>
-        <w:gridCol w:w="3024"/>
-        <w:gridCol w:w="3024"/>
-        <w:gridCol w:w="3024"/>
-      </w:tblGrid>
-      <w:tr>
-        <w:trPr>
-          <w:jc w:val="center"/>
-        </w:trPr>
-        <w:tc>
-          <w:tcPr>
-            <w:tcW w:w="3024" w:type="dxa"/>
-            <w:shd w:val="clear" w:color="auto" w:fill="D9EAF7"/>
-            <w:vAlign w:val="center"/>
-          </w:tcPr>
-          <w:p>
-            <w:r>
-              <w:rPr>
-                <w:b/>
-                <w:sz w:val="20"/>
-              </w:rPr>
-              <w:t>Endpoint</w:t>
-            </w:r>
-          </w:p>
-        </w:tc>
-        <w:tc>
-          <w:tcPr>
-            <w:tcW w:w="3024" w:type="dxa"/>
-            <w:shd w:val="clear" w:color="auto" w:fill="D9EAF7"/>
-            <w:vAlign w:val="center"/>
-          </w:tcPr>
-          <w:p>
-            <w:r>
-              <w:rPr>
-                <w:b/>
-                <w:sz w:val="20"/>
-              </w:rPr>
-              <w:t>Method</w:t>
-            </w:r>
-          </w:p>
-        </w:tc>
-        <w:tc>
-          <w:tcPr>
-            <w:tcW w:w="3024" w:type="dxa"/>
-            <w:shd w:val="clear" w:color="auto" w:fill="D9EAF7"/>
-            <w:vAlign w:val="center"/>
-          </w:tcPr>
-          <w:p>
-            <w:r>
-              <w:rPr>
-                <w:b/>
-                <w:sz w:val="20"/>
-              </w:rPr>
-              <w:t>Description</w:t>
-            </w:r>
-          </w:p>
-        </w:tc>
-      </w:tr>
-      <w:tr>
-        <w:trPr>
-          <w:jc w:val="center"/>
-        </w:trPr>
-        <w:tc>
-          <w:tcPr>
-            <w:tcW w:w="3024" w:type="dxa"/>
-            <w:vAlign w:val="center"/>
-          </w:tcPr>
-          <w:p>
-            <w:r>
-              <w:rPr>
-                <w:sz w:val="20"/>
-              </w:rPr>
-              <w:t>/</w:t>
-            </w:r>
-            <w:proofErr w:type="spellStart"/>
-            <w:r>
-              <w:rPr>
-                <w:sz w:val="20"/>
-              </w:rPr>
-              <w:t>api</w:t>
-            </w:r>
-            <w:proofErr w:type="spellEnd"/>
-            <w:r>
-              <w:rPr>
-                <w:sz w:val="20"/>
-              </w:rPr>
-              <w:t>/users</w:t>
-            </w:r>
-          </w:p>
-        </w:tc>
-        <w:tc>
-          <w:tcPr>
-            <w:tcW w:w="3024" w:type="dxa"/>
-            <w:vAlign w:val="center"/>
-          </w:tcPr>
-          <w:p>
-            <w:r>
-              <w:rPr>
-                <w:sz w:val="20"/>
-              </w:rPr>
-              <w:t>GET</w:t>
-            </w:r>
-          </w:p>
-        </w:tc>
-        <w:tc>
-          <w:tcPr>
-            <w:tcW w:w="3024" w:type="dxa"/>
-            <w:vAlign w:val="center"/>
-          </w:tcPr>
-          <w:p>
-            <w:r>
-              <w:rPr>
-                <w:sz w:val="20"/>
-              </w:rPr>
-              <w:t>Returns all users</w:t>
-            </w:r>
-          </w:p>
-        </w:tc>
-      </w:tr>
-      <w:tr>
-        <w:trPr>
-          <w:jc w:val="center"/>
-        </w:trPr>
-        <w:tc>
-          <w:tcPr>
-            <w:tcW w:w="3024" w:type="dxa"/>
-            <w:vAlign w:val="center"/>
-          </w:tcPr>
-          <w:p>
-            <w:r>
-              <w:rPr>
-                <w:sz w:val="20"/>
-              </w:rPr>
-              <w:t>/</w:t>
-            </w:r>
-            <w:proofErr w:type="spellStart"/>
-            <w:r>
-              <w:rPr>
-                <w:sz w:val="20"/>
-              </w:rPr>
-              <w:t>api</w:t>
-            </w:r>
-            <w:proofErr w:type="spellEnd"/>
-            <w:r>
-              <w:rPr>
-                <w:sz w:val="20"/>
-              </w:rPr>
-              <w:t>/resources</w:t>
-            </w:r>
-          </w:p>
-        </w:tc>
-        <w:tc>
-          <w:tcPr>
-            <w:tcW w:w="3024" w:type="dxa"/>
-            <w:vAlign w:val="center"/>
-          </w:tcPr>
-          <w:p>
-            <w:r>
-              <w:rPr>
-                <w:sz w:val="20"/>
-              </w:rPr>
-              <w:t>GET</w:t>
-            </w:r>
-          </w:p>
-        </w:tc>
-        <w:tc>
-          <w:tcPr>
-            <w:tcW w:w="3024" w:type="dxa"/>
-            <w:vAlign w:val="center"/>
-          </w:tcPr>
-          <w:p>
-            <w:r>
-              <w:rPr>
-                <w:sz w:val="20"/>
-              </w:rPr>
-              <w:t>Returns all resources and embedded time slots</w:t>
-            </w:r>
-          </w:p>
-        </w:tc>
-      </w:tr>
-      <w:tr>
-        <w:trPr>
-          <w:jc w:val="center"/>
-        </w:trPr>
-        <w:tc>
-          <w:tcPr>
-            <w:tcW w:w="3024" w:type="dxa"/>
-            <w:vAlign w:val="center"/>
-          </w:tcPr>
-          <w:p>
-            <w:r>
-              <w:rPr>
-                <w:sz w:val="20"/>
-              </w:rPr>
-              <w:t>/</w:t>
-            </w:r>
-            <w:proofErr w:type="spellStart"/>
-            <w:r>
-              <w:rPr>
-                <w:sz w:val="20"/>
-              </w:rPr>
-              <w:t>api</w:t>
-            </w:r>
-            <w:proofErr w:type="spellEnd"/>
-            <w:r>
-              <w:rPr>
-                <w:sz w:val="20"/>
-              </w:rPr>
-              <w:t>/reservations</w:t>
-            </w:r>
-          </w:p>
-        </w:tc>
-        <w:tc>
-          <w:tcPr>
-            <w:tcW w:w="3024" w:type="dxa"/>
-            <w:vAlign w:val="center"/>
-          </w:tcPr>
-          <w:p>
-            <w:r>
-              <w:rPr>
-                <w:sz w:val="20"/>
-              </w:rPr>
-              <w:t>GET</w:t>
-            </w:r>
-          </w:p>
-        </w:tc>
-        <w:tc>
-          <w:tcPr>
-            <w:tcW w:w="3024" w:type="dxa"/>
-            <w:vAlign w:val="center"/>
-          </w:tcPr>
-          <w:p>
-            <w:r>
-              <w:rPr>
-                <w:sz w:val="20"/>
-              </w:rPr>
-              <w:t>Returns all reservations</w:t>
-            </w:r>
-          </w:p>
-        </w:tc>
-      </w:tr>
-      <w:tr>
-        <w:trPr>
-          <w:jc w:val="center"/>
-        </w:trPr>
-        <w:tc>
-          <w:tcPr>
-            <w:tcW w:w="3024" w:type="dxa"/>
-            <w:vAlign w:val="center"/>
-          </w:tcPr>
-          <w:p>
-            <w:r>
-              <w:rPr>
-                <w:sz w:val="20"/>
-              </w:rPr>
-              <w:t>/</w:t>
-            </w:r>
-            <w:proofErr w:type="spellStart"/>
-            <w:r>
-              <w:rPr>
-                <w:sz w:val="20"/>
-              </w:rPr>
-              <w:t>api</w:t>
-            </w:r>
-            <w:proofErr w:type="spellEnd"/>
-            <w:r>
-              <w:rPr>
-                <w:sz w:val="20"/>
-              </w:rPr>
-              <w:t>/reservations</w:t>
-            </w:r>
-          </w:p>
-        </w:tc>
-        <w:tc>
-          <w:tcPr>
-            <w:tcW w:w="3024" w:type="dxa"/>
-            <w:vAlign w:val="center"/>
-          </w:tcPr>
-          <w:p>
-            <w:r>
-              <w:rPr>
-                <w:sz w:val="20"/>
-              </w:rPr>
-              <w:t>POST</w:t>
-            </w:r>
-          </w:p>
-        </w:tc>
-        <w:tc>
-          <w:tcPr>
-            <w:tcW w:w="3024" w:type="dxa"/>
-            <w:vAlign w:val="center"/>
-          </w:tcPr>
-          <w:p>
-            <w:r>
-              <w:rPr>
-                <w:sz w:val="20"/>
-              </w:rPr>
-              <w:t>Creates a reservation</w:t>
-            </w:r>
-          </w:p>
-        </w:tc>
-      </w:tr>
-      <w:tr>
-        <w:trPr>
-          <w:jc w:val="center"/>
-        </w:trPr>
-        <w:tc>
-          <w:tcPr>
-            <w:tcW w:w="3024" w:type="dxa"/>
-            <w:vAlign w:val="center"/>
-          </w:tcPr>
-          <w:p>
-            <w:r>
-              <w:rPr>
-                <w:sz w:val="20"/>
-              </w:rPr>
-              <w:t>/</w:t>
-            </w:r>
-            <w:proofErr w:type="spellStart"/>
-            <w:r>
-              <w:rPr>
-                <w:sz w:val="20"/>
-              </w:rPr>
-              <w:t>api</w:t>
-            </w:r>
-            <w:proofErr w:type="spellEnd"/>
-            <w:r>
-              <w:rPr>
-                <w:sz w:val="20"/>
-              </w:rPr>
-              <w:t>/seed</w:t>
-            </w:r>
-          </w:p>
-        </w:tc>
-        <w:tc>
-          <w:tcPr>
-            <w:tcW w:w="3024" w:type="dxa"/>
-            <w:vAlign w:val="center"/>
-          </w:tcPr>
-          <w:p>
-            <w:r>
-              <w:rPr>
-                <w:sz w:val="20"/>
-              </w:rPr>
-              <w:t>POST</w:t>
-            </w:r>
-          </w:p>
-        </w:tc>
-        <w:tc>
-          <w:tcPr>
-            <w:tcW w:w="3024" w:type="dxa"/>
-            <w:vAlign w:val="center"/>
-          </w:tcPr>
-          <w:p>
-            <w:r>
-              <w:rPr>
-                <w:sz w:val="20"/>
-              </w:rPr>
-              <w:t>Inserts sample data</w:t>
-            </w:r>
-          </w:p>
-        </w:tc>
-      </w:tr>
-    </w:tbl>
-    <w:p>
-      <w:pPr>
-        <w:spacing w:after="80"/>
-        <w:jc w:val="both"/>
-      </w:pPr>
-    </w:p>
-    <w:p>
-      <w:pPr>
-        <w:spacing w:before="240" w:after="60"/>
-      </w:pPr>
-      <w:r>
-        <w:rPr>
-          <w:b/>
-          <w:i/>
-          <w:sz w:val="24"/>
-        </w:rPr>
-        <w:t>7. Analysis of Results</w:t>
+        <w:t xml:space="preserve">    ├── TimeSlot</w:t>
       </w:r>
     </w:p>
     <w:p>
       <w:pPr>
-        <w:spacing w:after="120"/>
-        <w:jc w:val="both"/>
+        <w:pStyle w:val="CodeText"/>
       </w:pPr>
       <w:r>
-        <w:t xml:space="preserve">The implemented prototype demonstrates that MongoDB can represent the reservation model using a combination of embedded documents and references. The most important hierarchical structure is the Resource document, which contains an embedded </w:t>
+        <w:rPr>
+          <w:rFonts w:ascii="Times New Roman" w:eastAsia="Times New Roman" w:hAnsi="Times New Roman"/>
+        </w:rPr>
+        <w:t xml:space="preserve">    └── TimeSlot</w:t>
       </w:r>
-      <w:proofErr w:type="spellStart"/>
+    </w:p>
+    <w:p>
       <w:r>
-        <w:t>timeSlots</w:t>
+        <w:t>The availabilityWindows array is embedded because availability belongs directly to a resource. This design allows the backend to check whether a selected interval is inside one of the embedded windows. At the same time, reservations are stored separately because they represent independent events that reference users and resources.</w:t>
       </w:r>
-      <w:proofErr w:type="spellEnd"/>
+    </w:p>
+    <w:p>
       <w:r>
-        <w:t xml:space="preserve"> array. This structure is easy to read and suitable for the implemented booking workflow because the application needs to display available intervals together with each resource.</w:t>
+        <w:t>The resources collection includes several sample resource types: rooms, a computer science laboratory, equipment, a bicycle, a Christmas tree, a PlayStation, a DVD item and a guided building tour. The guided building tour demonstrates that the same model can handle scheduled services, not only physical objects.</w:t>
       </w:r>
     </w:p>
     <w:p>
       <w:pPr>
-        <w:spacing w:after="120"/>
-        <w:jc w:val="both"/>
+        <w:pStyle w:val="SectionHeading"/>
       </w:pPr>
       <w:r>
-        <w:t xml:space="preserve">The </w:t>
+        <w:lastRenderedPageBreak/>
+        <w:t>7. Implementation Using SvelteKit, Express and MongoDB</w:t>
       </w:r>
-      <w:proofErr w:type="spellStart"/>
+    </w:p>
+    <w:p>
       <w:r>
-        <w:t>SvelteKit</w:t>
+        <w:t>The frontend contains a SvelteKit page for reservations. The page loads data from the Express backend using HTTP requests. It does not use internal SvelteKit server routes for database access. This design makes the frontend responsibility limited to presentation and interaction.</w:t>
       </w:r>
-      <w:proofErr w:type="spellEnd"/>
+    </w:p>
+    <w:p>
       <w:r>
-        <w:t xml:space="preserve"> interface confirms the practical usability of the model. Users can select from available resources, choose a predefined slot and create a reservation. After a reservation is created, the selected slot no longer appears as available. This validates the connection between the user interface, API layer, TypeScript domain logic and MongoDB persistence.</w:t>
+        <w:t>The backend contains an Express server with routes for GET /users, GET /resources, GET /reservations, POST /reservations and POST /seed. The MongoDB connection is implemented using the official MongoDB Node.js driver, which supports JavaScript and TypeScript applications (MongoDB, 2026c).</w:t>
+      </w:r>
+    </w:p>
+    <w:p>
+      <w:r>
+        <w:t>The reservation endpoint receives userId, resourceId and slot. It validates the data by checking that the user and resource exist, that the date interval is valid, that the interval is inside an availability window, and that it does not overlap an existing reservation.</w:t>
+      </w:r>
+    </w:p>
+    <w:p>
+      <w:r>
+        <w:t>The backend domain logic is separated into TypeScript files: types.ts, maybe.ts, validation.ts, state.ts and reservation.ts. The createReservation function returns either a valid reservation or a list of validation errors. This makes the business logic independent from the Express route handler.</w:t>
       </w:r>
     </w:p>
     <w:p>
       <w:pPr>
-        <w:spacing w:after="120"/>
-        <w:jc w:val="both"/>
+        <w:pStyle w:val="SectionHeading"/>
       </w:pPr>
       <w:r>
-        <w:t>The main advantage of the model is clarity. It directly reflects the relationship between a resource and its available intervals. The main limitation is that embedded arrays can become large if a resource has many time slots. For a larger production system, additional indexing, pagination, concurrency handling and transaction-based updates may be required.</w:t>
+        <w:t>8. Analysis of Results</w:t>
+      </w:r>
+    </w:p>
+    <w:p>
+      <w:r>
+        <w:t>The final implementation satisfies the architectural requirement of separating frontend and backend. The repository now contains a frontend folder for SvelteKit and a backend folder for Express and MongoDB. This makes the system easier to understand and closer to a typical client-server structure.</w:t>
+      </w:r>
+    </w:p>
+    <w:p>
+      <w:r>
+        <w:t>The new reservation workflow also solves the problem of hardcoded time slots. The user can choose a start and end interval in the interface. The backend performs validation and decides if the interval is acceptable. This improves realism because the frontend no longer chooses only a fixed slot identifier.</w:t>
+      </w:r>
+    </w:p>
+    <w:p>
+      <w:r>
+        <w:t>The MongoDB hierarchical model remains visible because resource documents contain embedded availability windows. The selected reservation interval is not arbitrary from the database perspective: it must be inside one of these embedded windows. Therefore, the project combines flexible user input with hierarchical document modeling.</w:t>
+      </w:r>
+    </w:p>
+    <w:p>
+      <w:r>
+        <w:t>The prototype also prevents overlapping reservations. For example, if a reservation already exists from 12:30 to 13:00, a new request from 12:45 to 13:15 for the same resource is rejected. This demonstrates that application-level validation is necessary when using a document database without relational foreign-key constraints.</w:t>
       </w:r>
     </w:p>
     <w:p>
       <w:pPr>
-        <w:spacing w:before="160" w:after="0"/>
+        <w:pStyle w:val="SectionHeading"/>
       </w:pPr>
       <w:r>
-        <w:rPr>
-          <w:b/>
-          <w:sz w:val="20"/>
-        </w:rPr>
-        <w:t>Table 4. Embedded Document Structure Used in the Project</w:t>
+        <w:t>9. Discussion</w:t>
       </w:r>
     </w:p>
-    <w:tbl>
-      <w:tblPr>
-        <w:tblStyle w:val="Tabelgril"/>
-        <w:tblW w:w="0" w:type="auto"/>
-        <w:jc w:val="center"/>
-        <w:tblLook w:val="04A0" w:firstRow="1" w:lastRow="0" w:firstColumn="1" w:lastColumn="0" w:noHBand="0" w:noVBand="1"/>
-      </w:tblPr>
-      <w:tblGrid>
-        <w:gridCol w:w="3024"/>
-        <w:gridCol w:w="3024"/>
-        <w:gridCol w:w="3024"/>
-      </w:tblGrid>
-      <w:tr>
-        <w:trPr>
-          <w:jc w:val="center"/>
-        </w:trPr>
-        <w:tc>
-          <w:tcPr>
-            <w:tcW w:w="3024" w:type="dxa"/>
-            <w:shd w:val="clear" w:color="auto" w:fill="D9EAF7"/>
-            <w:vAlign w:val="center"/>
-          </w:tcPr>
-          <w:p>
-            <w:r>
-              <w:rPr>
-                <w:b/>
-                <w:sz w:val="20"/>
-              </w:rPr>
-              <w:t>MongoDB Document</w:t>
-            </w:r>
-          </w:p>
-        </w:tc>
-        <w:tc>
-          <w:tcPr>
-            <w:tcW w:w="3024" w:type="dxa"/>
-            <w:shd w:val="clear" w:color="auto" w:fill="D9EAF7"/>
-            <w:vAlign w:val="center"/>
-          </w:tcPr>
-          <w:p>
-            <w:r>
-              <w:rPr>
-                <w:b/>
-                <w:sz w:val="20"/>
-              </w:rPr>
-              <w:t>Embedded Field</w:t>
-            </w:r>
-          </w:p>
-        </w:tc>
-        <w:tc>
-          <w:tcPr>
-            <w:tcW w:w="3024" w:type="dxa"/>
-            <w:shd w:val="clear" w:color="auto" w:fill="D9EAF7"/>
-            <w:vAlign w:val="center"/>
-          </w:tcPr>
-          <w:p>
-            <w:r>
-              <w:rPr>
-                <w:b/>
-                <w:sz w:val="20"/>
-              </w:rPr>
-              <w:t>Reason</w:t>
-            </w:r>
-          </w:p>
-        </w:tc>
-      </w:tr>
-      <w:tr>
-        <w:trPr>
-          <w:jc w:val="center"/>
-        </w:trPr>
-        <w:tc>
-          <w:tcPr>
-            <w:tcW w:w="3024" w:type="dxa"/>
-            <w:vAlign w:val="center"/>
-          </w:tcPr>
-          <w:p>
-            <w:r>
-              <w:rPr>
-                <w:sz w:val="20"/>
-              </w:rPr>
-              <w:t>Resource</w:t>
-            </w:r>
-          </w:p>
-        </w:tc>
-        <w:tc>
-          <w:tcPr>
-            <w:tcW w:w="3024" w:type="dxa"/>
-            <w:vAlign w:val="center"/>
-          </w:tcPr>
-          <w:p>
-            <w:proofErr w:type="spellStart"/>
-            <w:proofErr w:type="gramStart"/>
-            <w:r>
-              <w:rPr>
-                <w:sz w:val="20"/>
-              </w:rPr>
-              <w:t>timeSlots</w:t>
-            </w:r>
-            <w:proofErr w:type="spellEnd"/>
-            <w:r>
-              <w:rPr>
-                <w:sz w:val="20"/>
-              </w:rPr>
-              <w:t>[</w:t>
-            </w:r>
-            <w:proofErr w:type="gramEnd"/>
-            <w:r>
-              <w:rPr>
-                <w:sz w:val="20"/>
-              </w:rPr>
-              <w:t>]</w:t>
-            </w:r>
-          </w:p>
-        </w:tc>
-        <w:tc>
-          <w:tcPr>
-            <w:tcW w:w="3024" w:type="dxa"/>
-            <w:vAlign w:val="center"/>
-          </w:tcPr>
-          <w:p>
-            <w:r>
-              <w:rPr>
-                <w:sz w:val="20"/>
-              </w:rPr>
-              <w:t>Time slots belong directly to a resource and are displayed together</w:t>
-            </w:r>
-          </w:p>
-        </w:tc>
-      </w:tr>
-      <w:tr>
-        <w:trPr>
-          <w:jc w:val="center"/>
-        </w:trPr>
-        <w:tc>
-          <w:tcPr>
-            <w:tcW w:w="3024" w:type="dxa"/>
-            <w:vAlign w:val="center"/>
-          </w:tcPr>
-          <w:p>
-            <w:proofErr w:type="spellStart"/>
-            <w:r>
-              <w:rPr>
-                <w:sz w:val="20"/>
-              </w:rPr>
-              <w:t>TimeSlot</w:t>
-            </w:r>
-            <w:proofErr w:type="spellEnd"/>
-          </w:p>
-        </w:tc>
-        <w:tc>
-          <w:tcPr>
-            <w:tcW w:w="3024" w:type="dxa"/>
-            <w:vAlign w:val="center"/>
-          </w:tcPr>
-          <w:p>
-            <w:r>
-              <w:rPr>
-                <w:sz w:val="20"/>
-              </w:rPr>
-              <w:t xml:space="preserve">start, end, </w:t>
-            </w:r>
-            <w:proofErr w:type="spellStart"/>
-            <w:r>
-              <w:rPr>
-                <w:sz w:val="20"/>
-              </w:rPr>
-              <w:t>isAvailable</w:t>
-            </w:r>
-            <w:proofErr w:type="spellEnd"/>
-          </w:p>
-        </w:tc>
-        <w:tc>
-          <w:tcPr>
-            <w:tcW w:w="3024" w:type="dxa"/>
-            <w:vAlign w:val="center"/>
-          </w:tcPr>
-          <w:p>
-            <w:r>
-              <w:rPr>
-                <w:sz w:val="20"/>
-              </w:rPr>
-              <w:t>Represents one predefined available interval</w:t>
-            </w:r>
-          </w:p>
-        </w:tc>
-      </w:tr>
-    </w:tbl>
     <w:p>
-      <w:pPr>
-        <w:spacing w:after="80"/>
-        <w:jc w:val="both"/>
-      </w:pPr>
+      <w:r>
+        <w:t>The separated architecture has several advantages. The frontend can be developed and tested independently from the backend. The backend can expose a clear API that could be consumed by another frontend in the future. MongoDB remains responsible for persistent storage, while TypeScript domain logic remains responsible for validation.</w:t>
+      </w:r>
     </w:p>
     <w:p>
-      <w:pPr>
-        <w:spacing w:before="240" w:after="60"/>
-      </w:pPr>
       <w:r>
-        <w:rPr>
-          <w:b/>
-          <w:i/>
-          <w:sz w:val="24"/>
-        </w:rPr>
-        <w:t>8. Conclusions</w:t>
+        <w:t>The use of availabilityWindows also makes the MongoDB model more flexible than a fixed slot-id approach. A resource may be available for a larger interval, and the user can select a smaller interval inside it. This design is useful for booking systems where resources are available during certain periods but users may reserve only part of that time.</w:t>
+      </w:r>
+    </w:p>
+    <w:p>
+      <w:r>
+        <w:t>The model also has limitations. The application currently reloads and saves state in a simple way, which is acceptable for a prototype but should be improved for production. In a high-concurrency environment, MongoDB transactions or atomic update strategies would be needed to avoid conflicts between simultaneous reservation requests.</w:t>
       </w:r>
     </w:p>
     <w:p>
       <w:pPr>
-        <w:spacing w:after="120"/>
-        <w:jc w:val="both"/>
+        <w:pStyle w:val="SectionHeading"/>
       </w:pPr>
       <w:r>
-        <w:t xml:space="preserve">This paper presented a </w:t>
+        <w:lastRenderedPageBreak/>
+        <w:t>10. Conclusions</w:t>
       </w:r>
-      <w:proofErr w:type="spellStart"/>
+    </w:p>
+    <w:p>
       <w:r>
-        <w:t>SvelteKit</w:t>
+        <w:t>This paper presented a reservation management system as a case study for hierarchical and non-relational data structures in MongoDB. The final implementation uses a separated SvelteKit frontend and Express backend. This separation clearly shows the difference between user interface logic and server-side database logic.</w:t>
       </w:r>
-      <w:proofErr w:type="spellEnd"/>
+    </w:p>
+    <w:p>
       <w:r>
-        <w:t xml:space="preserve"> and MongoDB reservation management system as a case study for hierarchical and non-relational data structures. The implemented application demonstrates how MongoDB documents can store embedded time slots inside resource documents while reservations reference users, resources and selected slots.</w:t>
+        <w:t>The project demonstrates how MongoDB can represent hierarchical data through embedded availability windows inside resource documents. At the same time, the reservations collection uses references to users and resources. This combination of embedded documents and references provides a practical document-oriented model.</w:t>
+      </w:r>
+    </w:p>
+    <w:p>
+      <w:r>
+        <w:t>The improved version allows users to select custom start and end intervals in the frontend. The backend validates these intervals against MongoDB availability windows and existing reservations. As a result, the system is both more realistic and still suitable for demonstrating hierarchical MongoDB modeling.</w:t>
       </w:r>
     </w:p>
     <w:p>
       <w:pPr>
-        <w:spacing w:after="120"/>
-        <w:jc w:val="both"/>
+        <w:pStyle w:val="SectionHeading"/>
       </w:pPr>
       <w:r>
-        <w:t xml:space="preserve">The project satisfies the practical objective of implementing a functional reservation flow. It also satisfies the academic objective of demonstrating MongoDB hierarchical modeling through the </w:t>
+        <w:t>11. Future Work</w:t>
       </w:r>
+    </w:p>
+    <w:p>
       <w:r>
-        <w:lastRenderedPageBreak/>
-        <w:t xml:space="preserve">Resource -&gt; </w:t>
-      </w:r>
-      <w:proofErr w:type="spellStart"/>
-      <w:proofErr w:type="gramStart"/>
-      <w:r>
-        <w:t>timeSlots</w:t>
-      </w:r>
-      <w:proofErr w:type="spellEnd"/>
-      <w:r>
-        <w:t>[</w:t>
-      </w:r>
-      <w:proofErr w:type="gramEnd"/>
-      <w:r>
-        <w:t>] structure. The extended resource set, including equipment and a guided building tour, shows that the model can support different categories of reservable entities.</w:t>
+        <w:t>Future work may include a more advanced calendar interface, authentication, role-based permissions, administrative resource management, MongoDB transactions for concurrent reservation handling, and visual reports about resource usage. Another improvement would be to add tests for the domain logic and API endpoints.</w:t>
       </w:r>
     </w:p>
     <w:p>
       <w:pPr>
-        <w:spacing w:after="120"/>
-        <w:jc w:val="both"/>
+        <w:pStyle w:val="SectionHeading"/>
       </w:pPr>
       <w:r>
-        <w:t>The study confirms that document-oriented modeling can be appropriate when related data is naturally accessed together. In this case, available time slots are strongly connected to resources, which makes embedding them inside resource documents a clear and effective design choice.</w:t>
-      </w:r>
-    </w:p>
-    <w:p>
-      <w:pPr>
-        <w:spacing w:before="240" w:after="60"/>
-      </w:pPr>
-      <w:r>
-        <w:rPr>
-          <w:b/>
-          <w:i/>
-          <w:sz w:val="24"/>
-        </w:rPr>
-        <w:t>9. Future Work</w:t>
-      </w:r>
-    </w:p>
-    <w:p>
-      <w:pPr>
-        <w:spacing w:after="120"/>
-        <w:jc w:val="both"/>
-      </w:pPr>
-      <w:r>
-        <w:t>Future work may extend the application with authentication, user roles, an administration interface for creating new resources and time slots, and advanced reporting. Another improvement would be the addition of screenshots and deployment instructions for public hosting.</w:t>
-      </w:r>
-    </w:p>
-    <w:p>
-      <w:pPr>
-        <w:spacing w:after="120"/>
-        <w:jc w:val="both"/>
-      </w:pPr>
-      <w:r>
-        <w:t>A future production version could also include stronger concurrency control, MongoDB transactions, date-based filtering, search options and an administrative calendar for generating predefined slots. The current version intentionally keeps predefined time slots because they clearly demonstrate the hierarchical MongoDB structure required by the case study.</w:t>
-      </w:r>
-    </w:p>
-    <w:p>
-      <w:pPr>
-        <w:spacing w:before="240" w:after="60"/>
-      </w:pPr>
-      <w:r>
-        <w:rPr>
-          <w:b/>
-          <w:i/>
-          <w:sz w:val="24"/>
-        </w:rPr>
         <w:t>References</w:t>
       </w:r>
     </w:p>
     <w:p>
       <w:pPr>
-        <w:spacing w:after="80"/>
+        <w:pStyle w:val="References"/>
       </w:pPr>
       <w:r>
-        <w:rPr>
-          <w:sz w:val="18"/>
-        </w:rPr>
-        <w:t>MongoDB. (2026a). Data modeling. MongoDB Manual. https://www.mongodb.com/docs/manual/data-modeling/</w:t>
+        <w:t>Express. (2026). Express - Node.js web application framework. Retrieved May 11, 2026, from https://expressjs.com/</w:t>
       </w:r>
     </w:p>
     <w:p>
       <w:pPr>
-        <w:spacing w:after="80"/>
+        <w:pStyle w:val="References"/>
       </w:pPr>
       <w:r>
-        <w:rPr>
-          <w:sz w:val="18"/>
-        </w:rPr>
-        <w:t>MongoDB. (2026b). Embedded data models. MongoDB Manual. https://www.mongodb.com/docs/manual/data-modeling/embedding/</w:t>
+        <w:t>MongoDB. (2026a). Data modeling. MongoDB Documentation. Retrieved May 11, 2026, from https://www.mongodb.com/docs/manual/data-modeling/</w:t>
       </w:r>
     </w:p>
     <w:p>
       <w:pPr>
-        <w:spacing w:after="80"/>
+        <w:pStyle w:val="References"/>
       </w:pPr>
       <w:r>
-        <w:rPr>
-          <w:sz w:val="18"/>
-        </w:rPr>
-        <w:t>MongoDB. (2026c). MongoDB Node.js driver documentation. https://www.mongodb.com/docs/drivers/node/current/</w:t>
+        <w:t>MongoDB. (2026b). Embedded data models. MongoDB Documentation. Retrieved May 11, 2026, from https://www.mongodb.com/docs/manual/data-modeling/embedding/</w:t>
       </w:r>
     </w:p>
     <w:p>
       <w:pPr>
-        <w:spacing w:after="80"/>
+        <w:pStyle w:val="References"/>
       </w:pPr>
-      <w:proofErr w:type="spellStart"/>
       <w:r>
-        <w:rPr>
-          <w:sz w:val="18"/>
-        </w:rPr>
-        <w:t>Sadalage</w:t>
-      </w:r>
-      <w:proofErr w:type="spellEnd"/>
-      <w:r>
-        <w:rPr>
-          <w:sz w:val="18"/>
-        </w:rPr>
-        <w:t>, P. J., &amp; Fowler, M. (2012). NoSQL distilled: A brief guide to the emerging world of polyglot persistence. Addison-Wesley.</w:t>
+        <w:t>MongoDB. (2026c). MongoDB Node.js driver. MongoDB Documentation. Retrieved May 11, 2026, from https://www.mongodb.com/docs/drivers/node/current/</w:t>
       </w:r>
     </w:p>
     <w:p>
       <w:pPr>
-        <w:spacing w:after="80"/>
+        <w:pStyle w:val="References"/>
       </w:pPr>
       <w:r>
-        <w:rPr>
-          <w:sz w:val="18"/>
-        </w:rPr>
-        <w:t xml:space="preserve">Svelte. (2026). </w:t>
+        <w:t>Sadalage, P. J., &amp; Fowler, M. (2012). NoSQL distilled: A brief guide to the emerging world of polyglot persistence. Addison-Wesley.</w:t>
       </w:r>
-      <w:proofErr w:type="spellStart"/>
+    </w:p>
+    <w:p>
+      <w:pPr>
+        <w:pStyle w:val="References"/>
+      </w:pPr>
       <w:r>
-        <w:rPr>
-          <w:sz w:val="18"/>
-        </w:rPr>
-        <w:t>SvelteKit</w:t>
-      </w:r>
-      <w:proofErr w:type="spellEnd"/>
-      <w:r>
-        <w:rPr>
-          <w:sz w:val="18"/>
-        </w:rPr>
-        <w:t xml:space="preserve"> routing. Svelte documentation. https://svelte.dev/docs/kit/routing</w:t>
+        <w:t>Svelte. (2026). Routing. SvelteKit Documentation. Retrieved May 11, 2026, from https://svelte.dev/docs/kit/routing</w:t>
       </w:r>
     </w:p>
     <w:sectPr>
@@ -2262,31 +998,31 @@
       </w:rPr>
     </w:lvl>
   </w:abstractNum>
-  <w:num w:numId="1" w16cid:durableId="1363165602">
+  <w:num w:numId="1" w16cid:durableId="2023778202">
     <w:abstractNumId w:val="8"/>
   </w:num>
-  <w:num w:numId="2" w16cid:durableId="816410894">
+  <w:num w:numId="2" w16cid:durableId="1141116187">
     <w:abstractNumId w:val="6"/>
   </w:num>
-  <w:num w:numId="3" w16cid:durableId="581334270">
+  <w:num w:numId="3" w16cid:durableId="74978326">
     <w:abstractNumId w:val="5"/>
   </w:num>
-  <w:num w:numId="4" w16cid:durableId="721749955">
+  <w:num w:numId="4" w16cid:durableId="2027713897">
     <w:abstractNumId w:val="4"/>
   </w:num>
-  <w:num w:numId="5" w16cid:durableId="833178819">
+  <w:num w:numId="5" w16cid:durableId="774833036">
     <w:abstractNumId w:val="7"/>
   </w:num>
-  <w:num w:numId="6" w16cid:durableId="1279024109">
+  <w:num w:numId="6" w16cid:durableId="1941985221">
     <w:abstractNumId w:val="3"/>
   </w:num>
-  <w:num w:numId="7" w16cid:durableId="1892687233">
+  <w:num w:numId="7" w16cid:durableId="222957114">
     <w:abstractNumId w:val="2"/>
   </w:num>
-  <w:num w:numId="8" w16cid:durableId="1083069202">
+  <w:num w:numId="8" w16cid:durableId="93088152">
     <w:abstractNumId w:val="1"/>
   </w:num>
-  <w:num w:numId="9" w16cid:durableId="1258489668">
+  <w:num w:numId="9" w16cid:durableId="534150278">
     <w:abstractNumId w:val="0"/>
   </w:num>
 </w:numbering>
@@ -2682,6 +1418,10 @@
     <w:name w:val="Normal"/>
     <w:qFormat/>
     <w:rsid w:val="00FC693F"/>
+    <w:pPr>
+      <w:spacing w:after="120"/>
+      <w:jc w:val="both"/>
+    </w:pPr>
     <w:rPr>
       <w:rFonts w:ascii="Times New Roman" w:eastAsia="Times New Roman" w:hAnsi="Times New Roman"/>
     </w:rPr>
@@ -3114,9 +1854,6 @@
     <w:uiPriority w:val="99"/>
     <w:unhideWhenUsed/>
     <w:rsid w:val="00AA1D8D"/>
-    <w:pPr>
-      <w:spacing w:after="120"/>
-    </w:pPr>
   </w:style>
   <w:style w:type="character" w:customStyle="1" w:styleId="CorptextCaracter">
     <w:name w:val="Corp text Caracter"/>
@@ -3133,7 +1870,7 @@
     <w:unhideWhenUsed/>
     <w:rsid w:val="00AA1D8D"/>
     <w:pPr>
-      <w:spacing w:after="120" w:line="480" w:lineRule="auto"/>
+      <w:spacing w:line="480" w:lineRule="auto"/>
     </w:pPr>
   </w:style>
   <w:style w:type="character" w:customStyle="1" w:styleId="Corptext2Caracter">
@@ -3150,9 +1887,6 @@
     <w:uiPriority w:val="99"/>
     <w:unhideWhenUsed/>
     <w:rsid w:val="00AA1D8D"/>
-    <w:pPr>
-      <w:spacing w:after="120"/>
-    </w:pPr>
     <w:rPr>
       <w:sz w:val="16"/>
       <w:szCs w:val="16"/>
@@ -3287,7 +2021,6 @@
     <w:unhideWhenUsed/>
     <w:rsid w:val="0029639D"/>
     <w:pPr>
-      <w:spacing w:after="120"/>
       <w:ind w:left="360"/>
       <w:contextualSpacing/>
     </w:pPr>
@@ -3299,7 +2032,6 @@
     <w:unhideWhenUsed/>
     <w:rsid w:val="0029639D"/>
     <w:pPr>
-      <w:spacing w:after="120"/>
       <w:ind w:left="720"/>
       <w:contextualSpacing/>
     </w:pPr>
@@ -3311,7 +2043,6 @@
     <w:unhideWhenUsed/>
     <w:rsid w:val="0029639D"/>
     <w:pPr>
-      <w:spacing w:after="120"/>
       <w:ind w:left="1080"/>
       <w:contextualSpacing/>
     </w:pPr>
@@ -3473,13 +2204,13 @@
     <w:qFormat/>
     <w:rsid w:val="00FC693F"/>
     <w:pPr>
-      <w:spacing w:line="240" w:lineRule="auto"/>
+      <w:jc w:val="left"/>
     </w:pPr>
     <w:rPr>
       <w:b/>
       <w:bCs/>
       <w:color w:val="4F81BD" w:themeColor="accent1"/>
-      <w:sz w:val="18"/>
+      <w:sz w:val="20"/>
       <w:szCs w:val="18"/>
     </w:rPr>
   </w:style>
@@ -13674,6 +12405,118 @@
         <w:shd w:val="clear" w:color="auto" w:fill="FBCAA2" w:themeFill="accent6" w:themeFillTint="7F"/>
       </w:tcPr>
     </w:tblStylePr>
+  </w:style>
+  <w:style w:type="paragraph" w:customStyle="1" w:styleId="PaperTitle">
+    <w:name w:val="PaperTitle"/>
+    <w:pPr>
+      <w:spacing w:after="120"/>
+      <w:jc w:val="center"/>
+    </w:pPr>
+    <w:rPr>
+      <w:rFonts w:ascii="Times New Roman" w:eastAsia="Times New Roman" w:hAnsi="Times New Roman"/>
+      <w:b/>
+      <w:sz w:val="28"/>
+    </w:rPr>
+  </w:style>
+  <w:style w:type="paragraph" w:customStyle="1" w:styleId="Authors">
+    <w:name w:val="Authors"/>
+    <w:pPr>
+      <w:spacing w:after="120"/>
+      <w:jc w:val="center"/>
+    </w:pPr>
+    <w:rPr>
+      <w:rFonts w:ascii="Times New Roman" w:eastAsia="Times New Roman" w:hAnsi="Times New Roman"/>
+      <w:sz w:val="24"/>
+    </w:rPr>
+  </w:style>
+  <w:style w:type="paragraph" w:customStyle="1" w:styleId="Affiliation">
+    <w:name w:val="Affiliation"/>
+    <w:pPr>
+      <w:spacing w:after="120"/>
+      <w:jc w:val="center"/>
+    </w:pPr>
+    <w:rPr>
+      <w:rFonts w:ascii="Times New Roman" w:eastAsia="Times New Roman" w:hAnsi="Times New Roman"/>
+      <w:sz w:val="20"/>
+    </w:rPr>
+  </w:style>
+  <w:style w:type="paragraph" w:customStyle="1" w:styleId="AbstractText">
+    <w:name w:val="AbstractText"/>
+    <w:pPr>
+      <w:spacing w:after="120"/>
+      <w:jc w:val="both"/>
+    </w:pPr>
+    <w:rPr>
+      <w:rFonts w:ascii="Times New Roman" w:eastAsia="Times New Roman" w:hAnsi="Times New Roman"/>
+      <w:sz w:val="18"/>
+    </w:rPr>
+  </w:style>
+  <w:style w:type="paragraph" w:customStyle="1" w:styleId="SectionHeading">
+    <w:name w:val="SectionHeading"/>
+    <w:pPr>
+      <w:spacing w:after="120"/>
+    </w:pPr>
+    <w:rPr>
+      <w:rFonts w:ascii="Times New Roman" w:eastAsia="Times New Roman" w:hAnsi="Times New Roman"/>
+      <w:b/>
+      <w:i/>
+      <w:sz w:val="24"/>
+    </w:rPr>
+  </w:style>
+  <w:style w:type="paragraph" w:customStyle="1" w:styleId="SubHeading">
+    <w:name w:val="SubHeading"/>
+    <w:pPr>
+      <w:spacing w:after="120"/>
+    </w:pPr>
+    <w:rPr>
+      <w:rFonts w:ascii="Times New Roman" w:eastAsia="Times New Roman" w:hAnsi="Times New Roman"/>
+      <w:b/>
+      <w:i/>
+    </w:rPr>
+  </w:style>
+  <w:style w:type="paragraph" w:customStyle="1" w:styleId="References">
+    <w:name w:val="References"/>
+    <w:pPr>
+      <w:spacing w:after="120"/>
+      <w:jc w:val="both"/>
+    </w:pPr>
+    <w:rPr>
+      <w:rFonts w:ascii="Times New Roman" w:eastAsia="Times New Roman" w:hAnsi="Times New Roman"/>
+      <w:sz w:val="18"/>
+    </w:rPr>
+  </w:style>
+  <w:style w:type="paragraph" w:customStyle="1" w:styleId="CodeText">
+    <w:name w:val="CodeText"/>
+    <w:pPr>
+      <w:spacing w:after="120"/>
+    </w:pPr>
+    <w:rPr>
+      <w:rFonts w:ascii="Courier New" w:eastAsia="Courier New" w:hAnsi="Courier New"/>
+      <w:sz w:val="18"/>
+    </w:rPr>
+  </w:style>
+  <w:style w:type="character" w:styleId="Hyperlink">
+    <w:name w:val="Hyperlink"/>
+    <w:basedOn w:val="Fontdeparagrafimplicit"/>
+    <w:uiPriority w:val="99"/>
+    <w:unhideWhenUsed/>
+    <w:rsid w:val="000467D6"/>
+    <w:rPr>
+      <w:color w:val="0000FF" w:themeColor="hyperlink"/>
+      <w:u w:val="single"/>
+    </w:rPr>
+  </w:style>
+  <w:style w:type="character" w:styleId="MeniuneNerezolvat">
+    <w:name w:val="Unresolved Mention"/>
+    <w:basedOn w:val="Fontdeparagrafimplicit"/>
+    <w:uiPriority w:val="99"/>
+    <w:semiHidden/>
+    <w:unhideWhenUsed/>
+    <w:rsid w:val="000467D6"/>
+    <w:rPr>
+      <w:color w:val="605E5C"/>
+      <w:shd w:val="clear" w:color="auto" w:fill="E1DFDD"/>
+    </w:rPr>
   </w:style>
 </w:styles>
 </file>

</xml_diff>